<commit_message>
Expand the TJ note to four findings
Adds Slumberland's recliner and motion sofa walls counted by model, and the
Franklin comparison, between the store-price section and the Minneapolis one.
The order now runs from La-Z-Boy's own network, to the dealer floor, to the
brand competing on it, to how the two price against each other.

Brand figures are model counts taking each model's cheapest configuration,
since a SKU count rewards stocking more fabrics of one chair rather than more
range. The method note says so.

Still not visually verified -- LibreOffice in this container cannot load even a
minimal docx -- so the check is structural: well-formed XML, 8 tables, 52 rows,
4 sections, and the text extracted in document order.
</commit_message>
<xml_diff>
--- a/lazyboy_analysis/deliverables/La-Z-Boy_pricing_note_2026-08-29.docx
+++ b/lazyboy_analysis/deliverables/La-Z-Boy_pricing_note_2026-08-29.docx
@@ -30,7 +30,7 @@
           <w:sz w:val="34"/>
           <w:szCs w:val="34"/>
         </w:rPr>
-        <w:t xml:space="preserve">Two things visible from outside La-Z-Boy</w:t>
+        <w:t xml:space="preserve">Four things visible from outside La-Z-Boy</w:t>
       </w:r>
     </w:p>
     <w:p>
@@ -1676,7 +1676,4223 @@
           <w:sz w:val="26"/>
           <w:szCs w:val="26"/>
         </w:rPr>
-        <w:t xml:space="preserve">2.  Slumberland beats your own Minneapolis stores where the margin is</w:t>
+        <w:t xml:space="preserve">2.  Slumberland's recliner wall, by model</w:t>
+      </w:r>
+    </w:p>
+    <w:p>
+      <w:pPr>
+        <w:spacing w:after="140" w:before="0"/>
+      </w:pPr>
+      <w:r>
+        <w:rPr>
+          <w:rFonts w:ascii="Calibri" w:cs="Calibri" w:eastAsia="Calibri" w:hAnsi="Calibri"/>
+          <w:color w:val="1F1D1A"/>
+          <w:sz w:val="21"/>
+          <w:szCs w:val="21"/>
+        </w:rPr>
+        <w:t xml:space="preserve">Counted by model rather than by SKU — a SKU count rewards a brand for stocking more fabrics of the same chair, a model count reflects range. “Entry” is the cheapest way a shopper can buy that model.</w:t>
+      </w:r>
+    </w:p>
+    <w:tbl>
+      <w:tblPr>
+        <w:tblW w:type="dxa" w:w="9360"/>
+        <w:tblBorders>
+          <w:top w:val="single" w:color="auto" w:sz="4"/>
+          <w:left w:val="single" w:color="auto" w:sz="4"/>
+          <w:bottom w:val="single" w:color="auto" w:sz="4"/>
+          <w:right w:val="single" w:color="auto" w:sz="4"/>
+          <w:insideH w:val="single" w:color="auto" w:sz="4"/>
+          <w:insideV w:val="single" w:color="auto" w:sz="4"/>
+        </w:tblBorders>
+      </w:tblPr>
+      <w:tblGrid>
+        <w:gridCol w:w="2900"/>
+        <w:gridCol w:w="1100"/>
+        <w:gridCol w:w="900"/>
+        <w:gridCol w:w="1500"/>
+        <w:gridCol w:w="1500"/>
+        <w:gridCol w:w="1460"/>
+      </w:tblGrid>
+      <w:tr>
+        <w:trPr>
+          <w:tblHeader/>
+        </w:trPr>
+        <w:tc>
+          <w:tcPr>
+            <w:tcW w:type="dxa" w:w="0"/>
+            <w:tcBorders>
+              <w:top w:val="single" w:color="D9D3C8" w:sz="2"/>
+              <w:left w:val="none"/>
+              <w:bottom w:val="single" w:color="D9D3C8" w:sz="2"/>
+              <w:right w:val="none"/>
+            </w:tcBorders>
+            <w:shd w:fill="F0EBE0" w:color="auto" w:val="clear"/>
+            <w:tcMar>
+              <w:top w:type="dxa" w:w="70"/>
+              <w:left w:type="dxa" w:w="110"/>
+              <w:bottom w:type="dxa" w:w="70"/>
+              <w:right w:type="dxa" w:w="110"/>
+            </w:tcMar>
+          </w:tcPr>
+          <w:p>
+            <w:pPr>
+              <w:spacing w:after="0"/>
+              <w:jc w:val="left"/>
+            </w:pPr>
+            <w:r>
+              <w:rPr>
+                <w:rFonts w:ascii="Calibri" w:cs="Calibri" w:eastAsia="Calibri" w:hAnsi="Calibri"/>
+                <w:b/>
+                <w:bCs/>
+                <w:color w:val="1F1D1A"/>
+                <w:sz w:val="19"/>
+                <w:szCs w:val="19"/>
+              </w:rPr>
+              <w:t xml:space="preserve">Recliners — 150 models</w:t>
+            </w:r>
+          </w:p>
+        </w:tc>
+        <w:tc>
+          <w:tcPr>
+            <w:tcW w:type="dxa" w:w="0"/>
+            <w:tcBorders>
+              <w:top w:val="single" w:color="D9D3C8" w:sz="2"/>
+              <w:left w:val="none"/>
+              <w:bottom w:val="single" w:color="D9D3C8" w:sz="2"/>
+              <w:right w:val="none"/>
+            </w:tcBorders>
+            <w:shd w:fill="F0EBE0" w:color="auto" w:val="clear"/>
+            <w:tcMar>
+              <w:top w:type="dxa" w:w="70"/>
+              <w:left w:type="dxa" w:w="110"/>
+              <w:bottom w:type="dxa" w:w="70"/>
+              <w:right w:type="dxa" w:w="110"/>
+            </w:tcMar>
+          </w:tcPr>
+          <w:p>
+            <w:pPr>
+              <w:spacing w:after="0"/>
+              <w:jc w:val="right"/>
+            </w:pPr>
+            <w:r>
+              <w:rPr>
+                <w:rFonts w:ascii="Calibri" w:cs="Calibri" w:eastAsia="Calibri" w:hAnsi="Calibri"/>
+                <w:b/>
+                <w:bCs/>
+                <w:color w:val="1F1D1A"/>
+                <w:sz w:val="19"/>
+                <w:szCs w:val="19"/>
+              </w:rPr>
+              <w:t xml:space="preserve">Models</w:t>
+            </w:r>
+          </w:p>
+        </w:tc>
+        <w:tc>
+          <w:tcPr>
+            <w:tcW w:type="dxa" w:w="0"/>
+            <w:tcBorders>
+              <w:top w:val="single" w:color="D9D3C8" w:sz="2"/>
+              <w:left w:val="none"/>
+              <w:bottom w:val="single" w:color="D9D3C8" w:sz="2"/>
+              <w:right w:val="none"/>
+            </w:tcBorders>
+            <w:shd w:fill="F0EBE0" w:color="auto" w:val="clear"/>
+            <w:tcMar>
+              <w:top w:type="dxa" w:w="70"/>
+              <w:left w:type="dxa" w:w="110"/>
+              <w:bottom w:type="dxa" w:w="70"/>
+              <w:right w:type="dxa" w:w="110"/>
+            </w:tcMar>
+          </w:tcPr>
+          <w:p>
+            <w:pPr>
+              <w:spacing w:after="0"/>
+              <w:jc w:val="right"/>
+            </w:pPr>
+            <w:r>
+              <w:rPr>
+                <w:rFonts w:ascii="Calibri" w:cs="Calibri" w:eastAsia="Calibri" w:hAnsi="Calibri"/>
+                <w:b/>
+                <w:bCs/>
+                <w:color w:val="1F1D1A"/>
+                <w:sz w:val="19"/>
+                <w:szCs w:val="19"/>
+              </w:rPr>
+              <w:t xml:space="preserve">Wall</w:t>
+            </w:r>
+          </w:p>
+        </w:tc>
+        <w:tc>
+          <w:tcPr>
+            <w:tcW w:type="dxa" w:w="0"/>
+            <w:tcBorders>
+              <w:top w:val="single" w:color="D9D3C8" w:sz="2"/>
+              <w:left w:val="none"/>
+              <w:bottom w:val="single" w:color="D9D3C8" w:sz="2"/>
+              <w:right w:val="none"/>
+            </w:tcBorders>
+            <w:shd w:fill="F0EBE0" w:color="auto" w:val="clear"/>
+            <w:tcMar>
+              <w:top w:type="dxa" w:w="70"/>
+              <w:left w:type="dxa" w:w="110"/>
+              <w:bottom w:type="dxa" w:w="70"/>
+              <w:right w:type="dxa" w:w="110"/>
+            </w:tcMar>
+          </w:tcPr>
+          <w:p>
+            <w:pPr>
+              <w:spacing w:after="0"/>
+              <w:jc w:val="right"/>
+            </w:pPr>
+            <w:r>
+              <w:rPr>
+                <w:rFonts w:ascii="Calibri" w:cs="Calibri" w:eastAsia="Calibri" w:hAnsi="Calibri"/>
+                <w:b/>
+                <w:bCs/>
+                <w:color w:val="1F1D1A"/>
+                <w:sz w:val="19"/>
+                <w:szCs w:val="19"/>
+              </w:rPr>
+              <w:t xml:space="preserve">List</w:t>
+            </w:r>
+          </w:p>
+        </w:tc>
+        <w:tc>
+          <w:tcPr>
+            <w:tcW w:type="dxa" w:w="0"/>
+            <w:tcBorders>
+              <w:top w:val="single" w:color="D9D3C8" w:sz="2"/>
+              <w:left w:val="none"/>
+              <w:bottom w:val="single" w:color="D9D3C8" w:sz="2"/>
+              <w:right w:val="none"/>
+            </w:tcBorders>
+            <w:shd w:fill="F0EBE0" w:color="auto" w:val="clear"/>
+            <w:tcMar>
+              <w:top w:type="dxa" w:w="70"/>
+              <w:left w:type="dxa" w:w="110"/>
+              <w:bottom w:type="dxa" w:w="70"/>
+              <w:right w:type="dxa" w:w="110"/>
+            </w:tcMar>
+          </w:tcPr>
+          <w:p>
+            <w:pPr>
+              <w:spacing w:after="0"/>
+              <w:jc w:val="right"/>
+            </w:pPr>
+            <w:r>
+              <w:rPr>
+                <w:rFonts w:ascii="Calibri" w:cs="Calibri" w:eastAsia="Calibri" w:hAnsi="Calibri"/>
+                <w:b/>
+                <w:bCs/>
+                <w:color w:val="1F1D1A"/>
+                <w:sz w:val="19"/>
+                <w:szCs w:val="19"/>
+              </w:rPr>
+              <w:t xml:space="preserve">Entry</w:t>
+            </w:r>
+          </w:p>
+        </w:tc>
+        <w:tc>
+          <w:tcPr>
+            <w:tcW w:type="dxa" w:w="0"/>
+            <w:tcBorders>
+              <w:top w:val="single" w:color="D9D3C8" w:sz="2"/>
+              <w:left w:val="none"/>
+              <w:bottom w:val="single" w:color="D9D3C8" w:sz="2"/>
+              <w:right w:val="none"/>
+            </w:tcBorders>
+            <w:shd w:fill="F0EBE0" w:color="auto" w:val="clear"/>
+            <w:tcMar>
+              <w:top w:type="dxa" w:w="70"/>
+              <w:left w:type="dxa" w:w="110"/>
+              <w:bottom w:type="dxa" w:w="70"/>
+              <w:right w:type="dxa" w:w="110"/>
+            </w:tcMar>
+          </w:tcPr>
+          <w:p>
+            <w:pPr>
+              <w:spacing w:after="0"/>
+              <w:jc w:val="right"/>
+            </w:pPr>
+            <w:r>
+              <w:rPr>
+                <w:rFonts w:ascii="Calibri" w:cs="Calibri" w:eastAsia="Calibri" w:hAnsi="Calibri"/>
+                <w:b/>
+                <w:bCs/>
+                <w:color w:val="1F1D1A"/>
+                <w:sz w:val="19"/>
+                <w:szCs w:val="19"/>
+              </w:rPr>
+              <w:t xml:space="preserve">Disc</w:t>
+            </w:r>
+          </w:p>
+        </w:tc>
+      </w:tr>
+      <w:tr>
+        <w:tc>
+          <w:tcPr>
+            <w:tcW w:type="dxa" w:w="0"/>
+            <w:tcBorders>
+              <w:top w:val="single" w:color="D9D3C8" w:sz="2"/>
+              <w:left w:val="none"/>
+              <w:bottom w:val="single" w:color="D9D3C8" w:sz="2"/>
+              <w:right w:val="none"/>
+            </w:tcBorders>
+            <w:tcMar>
+              <w:top w:type="dxa" w:w="70"/>
+              <w:left w:type="dxa" w:w="110"/>
+              <w:bottom w:type="dxa" w:w="70"/>
+              <w:right w:type="dxa" w:w="110"/>
+            </w:tcMar>
+          </w:tcPr>
+          <w:p>
+            <w:pPr>
+              <w:spacing w:after="0"/>
+              <w:jc w:val="left"/>
+            </w:pPr>
+            <w:r>
+              <w:rPr>
+                <w:rFonts w:ascii="Calibri" w:cs="Calibri" w:eastAsia="Calibri" w:hAnsi="Calibri"/>
+                <w:b w:val="false"/>
+                <w:bCs w:val="false"/>
+                <w:color w:val="1F1D1A"/>
+                <w:sz w:val="19"/>
+                <w:szCs w:val="19"/>
+              </w:rPr>
+              <w:t xml:space="preserve">La-Z-Boy</w:t>
+            </w:r>
+          </w:p>
+        </w:tc>
+        <w:tc>
+          <w:tcPr>
+            <w:tcW w:type="dxa" w:w="0"/>
+            <w:tcBorders>
+              <w:top w:val="single" w:color="D9D3C8" w:sz="2"/>
+              <w:left w:val="none"/>
+              <w:bottom w:val="single" w:color="D9D3C8" w:sz="2"/>
+              <w:right w:val="none"/>
+            </w:tcBorders>
+            <w:tcMar>
+              <w:top w:type="dxa" w:w="70"/>
+              <w:left w:type="dxa" w:w="110"/>
+              <w:bottom w:type="dxa" w:w="70"/>
+              <w:right w:type="dxa" w:w="110"/>
+            </w:tcMar>
+          </w:tcPr>
+          <w:p>
+            <w:pPr>
+              <w:spacing w:after="0"/>
+              <w:jc w:val="right"/>
+            </w:pPr>
+            <w:r>
+              <w:rPr>
+                <w:rFonts w:ascii="Calibri" w:cs="Calibri" w:eastAsia="Calibri" w:hAnsi="Calibri"/>
+                <w:b w:val="false"/>
+                <w:bCs w:val="false"/>
+                <w:color w:val="1F1D1A"/>
+                <w:sz w:val="19"/>
+                <w:szCs w:val="19"/>
+              </w:rPr>
+              <w:t xml:space="preserve">48</w:t>
+            </w:r>
+          </w:p>
+        </w:tc>
+        <w:tc>
+          <w:tcPr>
+            <w:tcW w:type="dxa" w:w="0"/>
+            <w:tcBorders>
+              <w:top w:val="single" w:color="D9D3C8" w:sz="2"/>
+              <w:left w:val="none"/>
+              <w:bottom w:val="single" w:color="D9D3C8" w:sz="2"/>
+              <w:right w:val="none"/>
+            </w:tcBorders>
+            <w:tcMar>
+              <w:top w:type="dxa" w:w="70"/>
+              <w:left w:type="dxa" w:w="110"/>
+              <w:bottom w:type="dxa" w:w="70"/>
+              <w:right w:type="dxa" w:w="110"/>
+            </w:tcMar>
+          </w:tcPr>
+          <w:p>
+            <w:pPr>
+              <w:spacing w:after="0"/>
+              <w:jc w:val="right"/>
+            </w:pPr>
+            <w:r>
+              <w:rPr>
+                <w:rFonts w:ascii="Calibri" w:cs="Calibri" w:eastAsia="Calibri" w:hAnsi="Calibri"/>
+                <w:b w:val="false"/>
+                <w:bCs w:val="false"/>
+                <w:color w:val="1F1D1A"/>
+                <w:sz w:val="19"/>
+                <w:szCs w:val="19"/>
+              </w:rPr>
+              <w:t xml:space="preserve">32%</w:t>
+            </w:r>
+          </w:p>
+        </w:tc>
+        <w:tc>
+          <w:tcPr>
+            <w:tcW w:type="dxa" w:w="0"/>
+            <w:tcBorders>
+              <w:top w:val="single" w:color="D9D3C8" w:sz="2"/>
+              <w:left w:val="none"/>
+              <w:bottom w:val="single" w:color="D9D3C8" w:sz="2"/>
+              <w:right w:val="none"/>
+            </w:tcBorders>
+            <w:tcMar>
+              <w:top w:type="dxa" w:w="70"/>
+              <w:left w:type="dxa" w:w="110"/>
+              <w:bottom w:type="dxa" w:w="70"/>
+              <w:right w:type="dxa" w:w="110"/>
+            </w:tcMar>
+          </w:tcPr>
+          <w:p>
+            <w:pPr>
+              <w:spacing w:after="0"/>
+              <w:jc w:val="right"/>
+            </w:pPr>
+            <w:r>
+              <w:rPr>
+                <w:rFonts w:ascii="Calibri" w:cs="Calibri" w:eastAsia="Calibri" w:hAnsi="Calibri"/>
+                <w:b w:val="false"/>
+                <w:bCs w:val="false"/>
+                <w:color w:val="1F1D1A"/>
+                <w:sz w:val="19"/>
+                <w:szCs w:val="19"/>
+              </w:rPr>
+              <w:t xml:space="preserve">$1,539</w:t>
+            </w:r>
+          </w:p>
+        </w:tc>
+        <w:tc>
+          <w:tcPr>
+            <w:tcW w:type="dxa" w:w="0"/>
+            <w:tcBorders>
+              <w:top w:val="single" w:color="D9D3C8" w:sz="2"/>
+              <w:left w:val="none"/>
+              <w:bottom w:val="single" w:color="D9D3C8" w:sz="2"/>
+              <w:right w:val="none"/>
+            </w:tcBorders>
+            <w:tcMar>
+              <w:top w:type="dxa" w:w="70"/>
+              <w:left w:type="dxa" w:w="110"/>
+              <w:bottom w:type="dxa" w:w="70"/>
+              <w:right w:type="dxa" w:w="110"/>
+            </w:tcMar>
+          </w:tcPr>
+          <w:p>
+            <w:pPr>
+              <w:spacing w:after="0"/>
+              <w:jc w:val="right"/>
+            </w:pPr>
+            <w:r>
+              <w:rPr>
+                <w:rFonts w:ascii="Calibri" w:cs="Calibri" w:eastAsia="Calibri" w:hAnsi="Calibri"/>
+                <w:b w:val="false"/>
+                <w:bCs w:val="false"/>
+                <w:color w:val="1F1D1A"/>
+                <w:sz w:val="19"/>
+                <w:szCs w:val="19"/>
+              </w:rPr>
+              <w:t xml:space="preserve">$1,000</w:t>
+            </w:r>
+          </w:p>
+        </w:tc>
+        <w:tc>
+          <w:tcPr>
+            <w:tcW w:type="dxa" w:w="0"/>
+            <w:tcBorders>
+              <w:top w:val="single" w:color="D9D3C8" w:sz="2"/>
+              <w:left w:val="none"/>
+              <w:bottom w:val="single" w:color="D9D3C8" w:sz="2"/>
+              <w:right w:val="none"/>
+            </w:tcBorders>
+            <w:tcMar>
+              <w:top w:type="dxa" w:w="70"/>
+              <w:left w:type="dxa" w:w="110"/>
+              <w:bottom w:type="dxa" w:w="70"/>
+              <w:right w:type="dxa" w:w="110"/>
+            </w:tcMar>
+          </w:tcPr>
+          <w:p>
+            <w:pPr>
+              <w:spacing w:after="0"/>
+              <w:jc w:val="right"/>
+            </w:pPr>
+            <w:r>
+              <w:rPr>
+                <w:rFonts w:ascii="Calibri" w:cs="Calibri" w:eastAsia="Calibri" w:hAnsi="Calibri"/>
+                <w:b w:val="false"/>
+                <w:bCs w:val="false"/>
+                <w:color w:val="1F1D1A"/>
+                <w:sz w:val="19"/>
+                <w:szCs w:val="19"/>
+              </w:rPr>
+              <w:t xml:space="preserve">41%</w:t>
+            </w:r>
+          </w:p>
+        </w:tc>
+      </w:tr>
+      <w:tr>
+        <w:tc>
+          <w:tcPr>
+            <w:tcW w:type="dxa" w:w="0"/>
+            <w:tcBorders>
+              <w:top w:val="single" w:color="D9D3C8" w:sz="2"/>
+              <w:left w:val="none"/>
+              <w:bottom w:val="single" w:color="D9D3C8" w:sz="2"/>
+              <w:right w:val="none"/>
+            </w:tcBorders>
+            <w:tcMar>
+              <w:top w:type="dxa" w:w="70"/>
+              <w:left w:type="dxa" w:w="110"/>
+              <w:bottom w:type="dxa" w:w="70"/>
+              <w:right w:type="dxa" w:w="110"/>
+            </w:tcMar>
+          </w:tcPr>
+          <w:p>
+            <w:pPr>
+              <w:spacing w:after="0"/>
+              <w:jc w:val="left"/>
+            </w:pPr>
+            <w:r>
+              <w:rPr>
+                <w:rFonts w:ascii="Calibri" w:cs="Calibri" w:eastAsia="Calibri" w:hAnsi="Calibri"/>
+                <w:b w:val="false"/>
+                <w:bCs w:val="false"/>
+                <w:color w:val="1F1D1A"/>
+                <w:sz w:val="19"/>
+                <w:szCs w:val="19"/>
+              </w:rPr>
+              <w:t xml:space="preserve">Franklin</w:t>
+            </w:r>
+          </w:p>
+        </w:tc>
+        <w:tc>
+          <w:tcPr>
+            <w:tcW w:type="dxa" w:w="0"/>
+            <w:tcBorders>
+              <w:top w:val="single" w:color="D9D3C8" w:sz="2"/>
+              <w:left w:val="none"/>
+              <w:bottom w:val="single" w:color="D9D3C8" w:sz="2"/>
+              <w:right w:val="none"/>
+            </w:tcBorders>
+            <w:tcMar>
+              <w:top w:type="dxa" w:w="70"/>
+              <w:left w:type="dxa" w:w="110"/>
+              <w:bottom w:type="dxa" w:w="70"/>
+              <w:right w:type="dxa" w:w="110"/>
+            </w:tcMar>
+          </w:tcPr>
+          <w:p>
+            <w:pPr>
+              <w:spacing w:after="0"/>
+              <w:jc w:val="right"/>
+            </w:pPr>
+            <w:r>
+              <w:rPr>
+                <w:rFonts w:ascii="Calibri" w:cs="Calibri" w:eastAsia="Calibri" w:hAnsi="Calibri"/>
+                <w:b w:val="false"/>
+                <w:bCs w:val="false"/>
+                <w:color w:val="1F1D1A"/>
+                <w:sz w:val="19"/>
+                <w:szCs w:val="19"/>
+              </w:rPr>
+              <w:t xml:space="preserve">36</w:t>
+            </w:r>
+          </w:p>
+        </w:tc>
+        <w:tc>
+          <w:tcPr>
+            <w:tcW w:type="dxa" w:w="0"/>
+            <w:tcBorders>
+              <w:top w:val="single" w:color="D9D3C8" w:sz="2"/>
+              <w:left w:val="none"/>
+              <w:bottom w:val="single" w:color="D9D3C8" w:sz="2"/>
+              <w:right w:val="none"/>
+            </w:tcBorders>
+            <w:tcMar>
+              <w:top w:type="dxa" w:w="70"/>
+              <w:left w:type="dxa" w:w="110"/>
+              <w:bottom w:type="dxa" w:w="70"/>
+              <w:right w:type="dxa" w:w="110"/>
+            </w:tcMar>
+          </w:tcPr>
+          <w:p>
+            <w:pPr>
+              <w:spacing w:after="0"/>
+              <w:jc w:val="right"/>
+            </w:pPr>
+            <w:r>
+              <w:rPr>
+                <w:rFonts w:ascii="Calibri" w:cs="Calibri" w:eastAsia="Calibri" w:hAnsi="Calibri"/>
+                <w:b w:val="false"/>
+                <w:bCs w:val="false"/>
+                <w:color w:val="1F1D1A"/>
+                <w:sz w:val="19"/>
+                <w:szCs w:val="19"/>
+              </w:rPr>
+              <w:t xml:space="preserve">24%</w:t>
+            </w:r>
+          </w:p>
+        </w:tc>
+        <w:tc>
+          <w:tcPr>
+            <w:tcW w:type="dxa" w:w="0"/>
+            <w:tcBorders>
+              <w:top w:val="single" w:color="D9D3C8" w:sz="2"/>
+              <w:left w:val="none"/>
+              <w:bottom w:val="single" w:color="D9D3C8" w:sz="2"/>
+              <w:right w:val="none"/>
+            </w:tcBorders>
+            <w:tcMar>
+              <w:top w:type="dxa" w:w="70"/>
+              <w:left w:type="dxa" w:w="110"/>
+              <w:bottom w:type="dxa" w:w="70"/>
+              <w:right w:type="dxa" w:w="110"/>
+            </w:tcMar>
+          </w:tcPr>
+          <w:p>
+            <w:pPr>
+              <w:spacing w:after="0"/>
+              <w:jc w:val="right"/>
+            </w:pPr>
+            <w:r>
+              <w:rPr>
+                <w:rFonts w:ascii="Calibri" w:cs="Calibri" w:eastAsia="Calibri" w:hAnsi="Calibri"/>
+                <w:b w:val="false"/>
+                <w:bCs w:val="false"/>
+                <w:color w:val="1F1D1A"/>
+                <w:sz w:val="19"/>
+                <w:szCs w:val="19"/>
+              </w:rPr>
+              <w:t xml:space="preserve">$1,500</w:t>
+            </w:r>
+          </w:p>
+        </w:tc>
+        <w:tc>
+          <w:tcPr>
+            <w:tcW w:type="dxa" w:w="0"/>
+            <w:tcBorders>
+              <w:top w:val="single" w:color="D9D3C8" w:sz="2"/>
+              <w:left w:val="none"/>
+              <w:bottom w:val="single" w:color="D9D3C8" w:sz="2"/>
+              <w:right w:val="none"/>
+            </w:tcBorders>
+            <w:tcMar>
+              <w:top w:type="dxa" w:w="70"/>
+              <w:left w:type="dxa" w:w="110"/>
+              <w:bottom w:type="dxa" w:w="70"/>
+              <w:right w:type="dxa" w:w="110"/>
+            </w:tcMar>
+          </w:tcPr>
+          <w:p>
+            <w:pPr>
+              <w:spacing w:after="0"/>
+              <w:jc w:val="right"/>
+            </w:pPr>
+            <w:r>
+              <w:rPr>
+                <w:rFonts w:ascii="Calibri" w:cs="Calibri" w:eastAsia="Calibri" w:hAnsi="Calibri"/>
+                <w:b w:val="false"/>
+                <w:bCs w:val="false"/>
+                <w:color w:val="1F1D1A"/>
+                <w:sz w:val="19"/>
+                <w:szCs w:val="19"/>
+              </w:rPr>
+              <w:t xml:space="preserve">$800</w:t>
+            </w:r>
+          </w:p>
+        </w:tc>
+        <w:tc>
+          <w:tcPr>
+            <w:tcW w:type="dxa" w:w="0"/>
+            <w:tcBorders>
+              <w:top w:val="single" w:color="D9D3C8" w:sz="2"/>
+              <w:left w:val="none"/>
+              <w:bottom w:val="single" w:color="D9D3C8" w:sz="2"/>
+              <w:right w:val="none"/>
+            </w:tcBorders>
+            <w:tcMar>
+              <w:top w:type="dxa" w:w="70"/>
+              <w:left w:type="dxa" w:w="110"/>
+              <w:bottom w:type="dxa" w:w="70"/>
+              <w:right w:type="dxa" w:w="110"/>
+            </w:tcMar>
+          </w:tcPr>
+          <w:p>
+            <w:pPr>
+              <w:spacing w:after="0"/>
+              <w:jc w:val="right"/>
+            </w:pPr>
+            <w:r>
+              <w:rPr>
+                <w:rFonts w:ascii="Calibri" w:cs="Calibri" w:eastAsia="Calibri" w:hAnsi="Calibri"/>
+                <w:b w:val="false"/>
+                <w:bCs w:val="false"/>
+                <w:color w:val="1F1D1A"/>
+                <w:sz w:val="19"/>
+                <w:szCs w:val="19"/>
+              </w:rPr>
+              <w:t xml:space="preserve">47%</w:t>
+            </w:r>
+          </w:p>
+        </w:tc>
+      </w:tr>
+      <w:tr>
+        <w:tc>
+          <w:tcPr>
+            <w:tcW w:type="dxa" w:w="0"/>
+            <w:tcBorders>
+              <w:top w:val="single" w:color="D9D3C8" w:sz="2"/>
+              <w:left w:val="none"/>
+              <w:bottom w:val="single" w:color="D9D3C8" w:sz="2"/>
+              <w:right w:val="none"/>
+            </w:tcBorders>
+            <w:tcMar>
+              <w:top w:type="dxa" w:w="70"/>
+              <w:left w:type="dxa" w:w="110"/>
+              <w:bottom w:type="dxa" w:w="70"/>
+              <w:right w:type="dxa" w:w="110"/>
+            </w:tcMar>
+          </w:tcPr>
+          <w:p>
+            <w:pPr>
+              <w:spacing w:after="0"/>
+              <w:jc w:val="left"/>
+            </w:pPr>
+            <w:r>
+              <w:rPr>
+                <w:rFonts w:ascii="Calibri" w:cs="Calibri" w:eastAsia="Calibri" w:hAnsi="Calibri"/>
+                <w:b w:val="false"/>
+                <w:bCs w:val="false"/>
+                <w:color w:val="1F1D1A"/>
+                <w:sz w:val="19"/>
+                <w:szCs w:val="19"/>
+              </w:rPr>
+              <w:t xml:space="preserve">Ashley</w:t>
+            </w:r>
+          </w:p>
+        </w:tc>
+        <w:tc>
+          <w:tcPr>
+            <w:tcW w:type="dxa" w:w="0"/>
+            <w:tcBorders>
+              <w:top w:val="single" w:color="D9D3C8" w:sz="2"/>
+              <w:left w:val="none"/>
+              <w:bottom w:val="single" w:color="D9D3C8" w:sz="2"/>
+              <w:right w:val="none"/>
+            </w:tcBorders>
+            <w:tcMar>
+              <w:top w:type="dxa" w:w="70"/>
+              <w:left w:type="dxa" w:w="110"/>
+              <w:bottom w:type="dxa" w:w="70"/>
+              <w:right w:type="dxa" w:w="110"/>
+            </w:tcMar>
+          </w:tcPr>
+          <w:p>
+            <w:pPr>
+              <w:spacing w:after="0"/>
+              <w:jc w:val="right"/>
+            </w:pPr>
+            <w:r>
+              <w:rPr>
+                <w:rFonts w:ascii="Calibri" w:cs="Calibri" w:eastAsia="Calibri" w:hAnsi="Calibri"/>
+                <w:b w:val="false"/>
+                <w:bCs w:val="false"/>
+                <w:color w:val="1F1D1A"/>
+                <w:sz w:val="19"/>
+                <w:szCs w:val="19"/>
+              </w:rPr>
+              <w:t xml:space="preserve">24</w:t>
+            </w:r>
+          </w:p>
+        </w:tc>
+        <w:tc>
+          <w:tcPr>
+            <w:tcW w:type="dxa" w:w="0"/>
+            <w:tcBorders>
+              <w:top w:val="single" w:color="D9D3C8" w:sz="2"/>
+              <w:left w:val="none"/>
+              <w:bottom w:val="single" w:color="D9D3C8" w:sz="2"/>
+              <w:right w:val="none"/>
+            </w:tcBorders>
+            <w:tcMar>
+              <w:top w:type="dxa" w:w="70"/>
+              <w:left w:type="dxa" w:w="110"/>
+              <w:bottom w:type="dxa" w:w="70"/>
+              <w:right w:type="dxa" w:w="110"/>
+            </w:tcMar>
+          </w:tcPr>
+          <w:p>
+            <w:pPr>
+              <w:spacing w:after="0"/>
+              <w:jc w:val="right"/>
+            </w:pPr>
+            <w:r>
+              <w:rPr>
+                <w:rFonts w:ascii="Calibri" w:cs="Calibri" w:eastAsia="Calibri" w:hAnsi="Calibri"/>
+                <w:b w:val="false"/>
+                <w:bCs w:val="false"/>
+                <w:color w:val="1F1D1A"/>
+                <w:sz w:val="19"/>
+                <w:szCs w:val="19"/>
+              </w:rPr>
+              <w:t xml:space="preserve">16%</w:t>
+            </w:r>
+          </w:p>
+        </w:tc>
+        <w:tc>
+          <w:tcPr>
+            <w:tcW w:type="dxa" w:w="0"/>
+            <w:tcBorders>
+              <w:top w:val="single" w:color="D9D3C8" w:sz="2"/>
+              <w:left w:val="none"/>
+              <w:bottom w:val="single" w:color="D9D3C8" w:sz="2"/>
+              <w:right w:val="none"/>
+            </w:tcBorders>
+            <w:tcMar>
+              <w:top w:type="dxa" w:w="70"/>
+              <w:left w:type="dxa" w:w="110"/>
+              <w:bottom w:type="dxa" w:w="70"/>
+              <w:right w:type="dxa" w:w="110"/>
+            </w:tcMar>
+          </w:tcPr>
+          <w:p>
+            <w:pPr>
+              <w:spacing w:after="0"/>
+              <w:jc w:val="right"/>
+            </w:pPr>
+            <w:r>
+              <w:rPr>
+                <w:rFonts w:ascii="Calibri" w:cs="Calibri" w:eastAsia="Calibri" w:hAnsi="Calibri"/>
+                <w:b w:val="false"/>
+                <w:bCs w:val="false"/>
+                <w:color w:val="1F1D1A"/>
+                <w:sz w:val="19"/>
+                <w:szCs w:val="19"/>
+              </w:rPr>
+              <w:t xml:space="preserve">$805</w:t>
+            </w:r>
+          </w:p>
+        </w:tc>
+        <w:tc>
+          <w:tcPr>
+            <w:tcW w:type="dxa" w:w="0"/>
+            <w:tcBorders>
+              <w:top w:val="single" w:color="D9D3C8" w:sz="2"/>
+              <w:left w:val="none"/>
+              <w:bottom w:val="single" w:color="D9D3C8" w:sz="2"/>
+              <w:right w:val="none"/>
+            </w:tcBorders>
+            <w:tcMar>
+              <w:top w:type="dxa" w:w="70"/>
+              <w:left w:type="dxa" w:w="110"/>
+              <w:bottom w:type="dxa" w:w="70"/>
+              <w:right w:type="dxa" w:w="110"/>
+            </w:tcMar>
+          </w:tcPr>
+          <w:p>
+            <w:pPr>
+              <w:spacing w:after="0"/>
+              <w:jc w:val="right"/>
+            </w:pPr>
+            <w:r>
+              <w:rPr>
+                <w:rFonts w:ascii="Calibri" w:cs="Calibri" w:eastAsia="Calibri" w:hAnsi="Calibri"/>
+                <w:b w:val="false"/>
+                <w:bCs w:val="false"/>
+                <w:color w:val="1F1D1A"/>
+                <w:sz w:val="19"/>
+                <w:szCs w:val="19"/>
+              </w:rPr>
+              <w:t xml:space="preserve">$520</w:t>
+            </w:r>
+          </w:p>
+        </w:tc>
+        <w:tc>
+          <w:tcPr>
+            <w:tcW w:type="dxa" w:w="0"/>
+            <w:tcBorders>
+              <w:top w:val="single" w:color="D9D3C8" w:sz="2"/>
+              <w:left w:val="none"/>
+              <w:bottom w:val="single" w:color="D9D3C8" w:sz="2"/>
+              <w:right w:val="none"/>
+            </w:tcBorders>
+            <w:tcMar>
+              <w:top w:type="dxa" w:w="70"/>
+              <w:left w:type="dxa" w:w="110"/>
+              <w:bottom w:type="dxa" w:w="70"/>
+              <w:right w:type="dxa" w:w="110"/>
+            </w:tcMar>
+          </w:tcPr>
+          <w:p>
+            <w:pPr>
+              <w:spacing w:after="0"/>
+              <w:jc w:val="right"/>
+            </w:pPr>
+            <w:r>
+              <w:rPr>
+                <w:rFonts w:ascii="Calibri" w:cs="Calibri" w:eastAsia="Calibri" w:hAnsi="Calibri"/>
+                <w:b w:val="false"/>
+                <w:bCs w:val="false"/>
+                <w:color w:val="1F1D1A"/>
+                <w:sz w:val="19"/>
+                <w:szCs w:val="19"/>
+              </w:rPr>
+              <w:t xml:space="preserve">36%</w:t>
+            </w:r>
+          </w:p>
+        </w:tc>
+      </w:tr>
+      <w:tr>
+        <w:tc>
+          <w:tcPr>
+            <w:tcW w:type="dxa" w:w="0"/>
+            <w:tcBorders>
+              <w:top w:val="single" w:color="D9D3C8" w:sz="2"/>
+              <w:left w:val="none"/>
+              <w:bottom w:val="single" w:color="D9D3C8" w:sz="2"/>
+              <w:right w:val="none"/>
+            </w:tcBorders>
+            <w:tcMar>
+              <w:top w:type="dxa" w:w="70"/>
+              <w:left w:type="dxa" w:w="110"/>
+              <w:bottom w:type="dxa" w:w="70"/>
+              <w:right w:type="dxa" w:w="110"/>
+            </w:tcMar>
+          </w:tcPr>
+          <w:p>
+            <w:pPr>
+              <w:spacing w:after="0"/>
+              <w:jc w:val="left"/>
+            </w:pPr>
+            <w:r>
+              <w:rPr>
+                <w:rFonts w:ascii="Calibri" w:cs="Calibri" w:eastAsia="Calibri" w:hAnsi="Calibri"/>
+                <w:b w:val="false"/>
+                <w:bCs w:val="false"/>
+                <w:color w:val="1F1D1A"/>
+                <w:sz w:val="19"/>
+                <w:szCs w:val="19"/>
+              </w:rPr>
+              <w:t xml:space="preserve">Southern Motion</w:t>
+            </w:r>
+          </w:p>
+        </w:tc>
+        <w:tc>
+          <w:tcPr>
+            <w:tcW w:type="dxa" w:w="0"/>
+            <w:tcBorders>
+              <w:top w:val="single" w:color="D9D3C8" w:sz="2"/>
+              <w:left w:val="none"/>
+              <w:bottom w:val="single" w:color="D9D3C8" w:sz="2"/>
+              <w:right w:val="none"/>
+            </w:tcBorders>
+            <w:tcMar>
+              <w:top w:type="dxa" w:w="70"/>
+              <w:left w:type="dxa" w:w="110"/>
+              <w:bottom w:type="dxa" w:w="70"/>
+              <w:right w:type="dxa" w:w="110"/>
+            </w:tcMar>
+          </w:tcPr>
+          <w:p>
+            <w:pPr>
+              <w:spacing w:after="0"/>
+              <w:jc w:val="right"/>
+            </w:pPr>
+            <w:r>
+              <w:rPr>
+                <w:rFonts w:ascii="Calibri" w:cs="Calibri" w:eastAsia="Calibri" w:hAnsi="Calibri"/>
+                <w:b w:val="false"/>
+                <w:bCs w:val="false"/>
+                <w:color w:val="1F1D1A"/>
+                <w:sz w:val="19"/>
+                <w:szCs w:val="19"/>
+              </w:rPr>
+              <w:t xml:space="preserve">14</w:t>
+            </w:r>
+          </w:p>
+        </w:tc>
+        <w:tc>
+          <w:tcPr>
+            <w:tcW w:type="dxa" w:w="0"/>
+            <w:tcBorders>
+              <w:top w:val="single" w:color="D9D3C8" w:sz="2"/>
+              <w:left w:val="none"/>
+              <w:bottom w:val="single" w:color="D9D3C8" w:sz="2"/>
+              <w:right w:val="none"/>
+            </w:tcBorders>
+            <w:tcMar>
+              <w:top w:type="dxa" w:w="70"/>
+              <w:left w:type="dxa" w:w="110"/>
+              <w:bottom w:type="dxa" w:w="70"/>
+              <w:right w:type="dxa" w:w="110"/>
+            </w:tcMar>
+          </w:tcPr>
+          <w:p>
+            <w:pPr>
+              <w:spacing w:after="0"/>
+              <w:jc w:val="right"/>
+            </w:pPr>
+            <w:r>
+              <w:rPr>
+                <w:rFonts w:ascii="Calibri" w:cs="Calibri" w:eastAsia="Calibri" w:hAnsi="Calibri"/>
+                <w:b w:val="false"/>
+                <w:bCs w:val="false"/>
+                <w:color w:val="1F1D1A"/>
+                <w:sz w:val="19"/>
+                <w:szCs w:val="19"/>
+              </w:rPr>
+              <w:t xml:space="preserve">9%</w:t>
+            </w:r>
+          </w:p>
+        </w:tc>
+        <w:tc>
+          <w:tcPr>
+            <w:tcW w:type="dxa" w:w="0"/>
+            <w:tcBorders>
+              <w:top w:val="single" w:color="D9D3C8" w:sz="2"/>
+              <w:left w:val="none"/>
+              <w:bottom w:val="single" w:color="D9D3C8" w:sz="2"/>
+              <w:right w:val="none"/>
+            </w:tcBorders>
+            <w:tcMar>
+              <w:top w:type="dxa" w:w="70"/>
+              <w:left w:type="dxa" w:w="110"/>
+              <w:bottom w:type="dxa" w:w="70"/>
+              <w:right w:type="dxa" w:w="110"/>
+            </w:tcMar>
+          </w:tcPr>
+          <w:p>
+            <w:pPr>
+              <w:spacing w:after="0"/>
+              <w:jc w:val="right"/>
+            </w:pPr>
+            <w:r>
+              <w:rPr>
+                <w:rFonts w:ascii="Calibri" w:cs="Calibri" w:eastAsia="Calibri" w:hAnsi="Calibri"/>
+                <w:b w:val="false"/>
+                <w:bCs w:val="false"/>
+                <w:color w:val="1F1D1A"/>
+                <w:sz w:val="19"/>
+                <w:szCs w:val="19"/>
+              </w:rPr>
+              <w:t xml:space="preserve">$2,475</w:t>
+            </w:r>
+          </w:p>
+        </w:tc>
+        <w:tc>
+          <w:tcPr>
+            <w:tcW w:type="dxa" w:w="0"/>
+            <w:tcBorders>
+              <w:top w:val="single" w:color="D9D3C8" w:sz="2"/>
+              <w:left w:val="none"/>
+              <w:bottom w:val="single" w:color="D9D3C8" w:sz="2"/>
+              <w:right w:val="none"/>
+            </w:tcBorders>
+            <w:tcMar>
+              <w:top w:type="dxa" w:w="70"/>
+              <w:left w:type="dxa" w:w="110"/>
+              <w:bottom w:type="dxa" w:w="70"/>
+              <w:right w:type="dxa" w:w="110"/>
+            </w:tcMar>
+          </w:tcPr>
+          <w:p>
+            <w:pPr>
+              <w:spacing w:after="0"/>
+              <w:jc w:val="right"/>
+            </w:pPr>
+            <w:r>
+              <w:rPr>
+                <w:rFonts w:ascii="Calibri" w:cs="Calibri" w:eastAsia="Calibri" w:hAnsi="Calibri"/>
+                <w:b w:val="false"/>
+                <w:bCs w:val="false"/>
+                <w:color w:val="1F1D1A"/>
+                <w:sz w:val="19"/>
+                <w:szCs w:val="19"/>
+              </w:rPr>
+              <w:t xml:space="preserve">$1,550</w:t>
+            </w:r>
+          </w:p>
+        </w:tc>
+        <w:tc>
+          <w:tcPr>
+            <w:tcW w:type="dxa" w:w="0"/>
+            <w:tcBorders>
+              <w:top w:val="single" w:color="D9D3C8" w:sz="2"/>
+              <w:left w:val="none"/>
+              <w:bottom w:val="single" w:color="D9D3C8" w:sz="2"/>
+              <w:right w:val="none"/>
+            </w:tcBorders>
+            <w:tcMar>
+              <w:top w:type="dxa" w:w="70"/>
+              <w:left w:type="dxa" w:w="110"/>
+              <w:bottom w:type="dxa" w:w="70"/>
+              <w:right w:type="dxa" w:w="110"/>
+            </w:tcMar>
+          </w:tcPr>
+          <w:p>
+            <w:pPr>
+              <w:spacing w:after="0"/>
+              <w:jc w:val="right"/>
+            </w:pPr>
+            <w:r>
+              <w:rPr>
+                <w:rFonts w:ascii="Calibri" w:cs="Calibri" w:eastAsia="Calibri" w:hAnsi="Calibri"/>
+                <w:b w:val="false"/>
+                <w:bCs w:val="false"/>
+                <w:color w:val="1F1D1A"/>
+                <w:sz w:val="19"/>
+                <w:szCs w:val="19"/>
+              </w:rPr>
+              <w:t xml:space="preserve">33%</w:t>
+            </w:r>
+          </w:p>
+        </w:tc>
+      </w:tr>
+      <w:tr>
+        <w:tc>
+          <w:tcPr>
+            <w:tcW w:type="dxa" w:w="0"/>
+            <w:tcBorders>
+              <w:top w:val="single" w:color="D9D3C8" w:sz="2"/>
+              <w:left w:val="none"/>
+              <w:bottom w:val="single" w:color="D9D3C8" w:sz="2"/>
+              <w:right w:val="none"/>
+            </w:tcBorders>
+            <w:tcMar>
+              <w:top w:type="dxa" w:w="70"/>
+              <w:left w:type="dxa" w:w="110"/>
+              <w:bottom w:type="dxa" w:w="70"/>
+              <w:right w:type="dxa" w:w="110"/>
+            </w:tcMar>
+          </w:tcPr>
+          <w:p>
+            <w:pPr>
+              <w:spacing w:after="0"/>
+              <w:jc w:val="left"/>
+            </w:pPr>
+            <w:r>
+              <w:rPr>
+                <w:rFonts w:ascii="Calibri" w:cs="Calibri" w:eastAsia="Calibri" w:hAnsi="Calibri"/>
+                <w:b w:val="false"/>
+                <w:bCs w:val="false"/>
+                <w:color w:val="1F1D1A"/>
+                <w:sz w:val="19"/>
+                <w:szCs w:val="19"/>
+              </w:rPr>
+              <w:t xml:space="preserve">Flexsteel</w:t>
+            </w:r>
+          </w:p>
+        </w:tc>
+        <w:tc>
+          <w:tcPr>
+            <w:tcW w:type="dxa" w:w="0"/>
+            <w:tcBorders>
+              <w:top w:val="single" w:color="D9D3C8" w:sz="2"/>
+              <w:left w:val="none"/>
+              <w:bottom w:val="single" w:color="D9D3C8" w:sz="2"/>
+              <w:right w:val="none"/>
+            </w:tcBorders>
+            <w:tcMar>
+              <w:top w:type="dxa" w:w="70"/>
+              <w:left w:type="dxa" w:w="110"/>
+              <w:bottom w:type="dxa" w:w="70"/>
+              <w:right w:type="dxa" w:w="110"/>
+            </w:tcMar>
+          </w:tcPr>
+          <w:p>
+            <w:pPr>
+              <w:spacing w:after="0"/>
+              <w:jc w:val="right"/>
+            </w:pPr>
+            <w:r>
+              <w:rPr>
+                <w:rFonts w:ascii="Calibri" w:cs="Calibri" w:eastAsia="Calibri" w:hAnsi="Calibri"/>
+                <w:b w:val="false"/>
+                <w:bCs w:val="false"/>
+                <w:color w:val="1F1D1A"/>
+                <w:sz w:val="19"/>
+                <w:szCs w:val="19"/>
+              </w:rPr>
+              <w:t xml:space="preserve">11</w:t>
+            </w:r>
+          </w:p>
+        </w:tc>
+        <w:tc>
+          <w:tcPr>
+            <w:tcW w:type="dxa" w:w="0"/>
+            <w:tcBorders>
+              <w:top w:val="single" w:color="D9D3C8" w:sz="2"/>
+              <w:left w:val="none"/>
+              <w:bottom w:val="single" w:color="D9D3C8" w:sz="2"/>
+              <w:right w:val="none"/>
+            </w:tcBorders>
+            <w:tcMar>
+              <w:top w:type="dxa" w:w="70"/>
+              <w:left w:type="dxa" w:w="110"/>
+              <w:bottom w:type="dxa" w:w="70"/>
+              <w:right w:type="dxa" w:w="110"/>
+            </w:tcMar>
+          </w:tcPr>
+          <w:p>
+            <w:pPr>
+              <w:spacing w:after="0"/>
+              <w:jc w:val="right"/>
+            </w:pPr>
+            <w:r>
+              <w:rPr>
+                <w:rFonts w:ascii="Calibri" w:cs="Calibri" w:eastAsia="Calibri" w:hAnsi="Calibri"/>
+                <w:b w:val="false"/>
+                <w:bCs w:val="false"/>
+                <w:color w:val="1F1D1A"/>
+                <w:sz w:val="19"/>
+                <w:szCs w:val="19"/>
+              </w:rPr>
+              <w:t xml:space="preserve">7%</w:t>
+            </w:r>
+          </w:p>
+        </w:tc>
+        <w:tc>
+          <w:tcPr>
+            <w:tcW w:type="dxa" w:w="0"/>
+            <w:tcBorders>
+              <w:top w:val="single" w:color="D9D3C8" w:sz="2"/>
+              <w:left w:val="none"/>
+              <w:bottom w:val="single" w:color="D9D3C8" w:sz="2"/>
+              <w:right w:val="none"/>
+            </w:tcBorders>
+            <w:tcMar>
+              <w:top w:type="dxa" w:w="70"/>
+              <w:left w:type="dxa" w:w="110"/>
+              <w:bottom w:type="dxa" w:w="70"/>
+              <w:right w:type="dxa" w:w="110"/>
+            </w:tcMar>
+          </w:tcPr>
+          <w:p>
+            <w:pPr>
+              <w:spacing w:after="0"/>
+              <w:jc w:val="right"/>
+            </w:pPr>
+            <w:r>
+              <w:rPr>
+                <w:rFonts w:ascii="Calibri" w:cs="Calibri" w:eastAsia="Calibri" w:hAnsi="Calibri"/>
+                <w:b w:val="false"/>
+                <w:bCs w:val="false"/>
+                <w:color w:val="1F1D1A"/>
+                <w:sz w:val="19"/>
+                <w:szCs w:val="19"/>
+              </w:rPr>
+              <w:t xml:space="preserve">$2,550</w:t>
+            </w:r>
+          </w:p>
+        </w:tc>
+        <w:tc>
+          <w:tcPr>
+            <w:tcW w:type="dxa" w:w="0"/>
+            <w:tcBorders>
+              <w:top w:val="single" w:color="D9D3C8" w:sz="2"/>
+              <w:left w:val="none"/>
+              <w:bottom w:val="single" w:color="D9D3C8" w:sz="2"/>
+              <w:right w:val="none"/>
+            </w:tcBorders>
+            <w:tcMar>
+              <w:top w:type="dxa" w:w="70"/>
+              <w:left w:type="dxa" w:w="110"/>
+              <w:bottom w:type="dxa" w:w="70"/>
+              <w:right w:type="dxa" w:w="110"/>
+            </w:tcMar>
+          </w:tcPr>
+          <w:p>
+            <w:pPr>
+              <w:spacing w:after="0"/>
+              <w:jc w:val="right"/>
+            </w:pPr>
+            <w:r>
+              <w:rPr>
+                <w:rFonts w:ascii="Calibri" w:cs="Calibri" w:eastAsia="Calibri" w:hAnsi="Calibri"/>
+                <w:b w:val="false"/>
+                <w:bCs w:val="false"/>
+                <w:color w:val="1F1D1A"/>
+                <w:sz w:val="19"/>
+                <w:szCs w:val="19"/>
+              </w:rPr>
+              <w:t xml:space="preserve">$1,900</w:t>
+            </w:r>
+          </w:p>
+        </w:tc>
+        <w:tc>
+          <w:tcPr>
+            <w:tcW w:type="dxa" w:w="0"/>
+            <w:tcBorders>
+              <w:top w:val="single" w:color="D9D3C8" w:sz="2"/>
+              <w:left w:val="none"/>
+              <w:bottom w:val="single" w:color="D9D3C8" w:sz="2"/>
+              <w:right w:val="none"/>
+            </w:tcBorders>
+            <w:tcMar>
+              <w:top w:type="dxa" w:w="70"/>
+              <w:left w:type="dxa" w:w="110"/>
+              <w:bottom w:type="dxa" w:w="70"/>
+              <w:right w:type="dxa" w:w="110"/>
+            </w:tcMar>
+          </w:tcPr>
+          <w:p>
+            <w:pPr>
+              <w:spacing w:after="0"/>
+              <w:jc w:val="right"/>
+            </w:pPr>
+            <w:r>
+              <w:rPr>
+                <w:rFonts w:ascii="Calibri" w:cs="Calibri" w:eastAsia="Calibri" w:hAnsi="Calibri"/>
+                <w:b w:val="false"/>
+                <w:bCs w:val="false"/>
+                <w:color w:val="1F1D1A"/>
+                <w:sz w:val="19"/>
+                <w:szCs w:val="19"/>
+              </w:rPr>
+              <w:t xml:space="preserve">26%</w:t>
+            </w:r>
+          </w:p>
+        </w:tc>
+      </w:tr>
+      <w:tr>
+        <w:tc>
+          <w:tcPr>
+            <w:tcW w:type="dxa" w:w="0"/>
+            <w:tcBorders>
+              <w:top w:val="single" w:color="D9D3C8" w:sz="2"/>
+              <w:left w:val="none"/>
+              <w:bottom w:val="single" w:color="D9D3C8" w:sz="2"/>
+              <w:right w:val="none"/>
+            </w:tcBorders>
+            <w:tcMar>
+              <w:top w:type="dxa" w:w="70"/>
+              <w:left w:type="dxa" w:w="110"/>
+              <w:bottom w:type="dxa" w:w="70"/>
+              <w:right w:type="dxa" w:w="110"/>
+            </w:tcMar>
+          </w:tcPr>
+          <w:p>
+            <w:pPr>
+              <w:spacing w:after="0"/>
+              <w:jc w:val="left"/>
+            </w:pPr>
+            <w:r>
+              <w:rPr>
+                <w:rFonts w:ascii="Calibri" w:cs="Calibri" w:eastAsia="Calibri" w:hAnsi="Calibri"/>
+                <w:b w:val="false"/>
+                <w:bCs w:val="false"/>
+                <w:color w:val="1F1D1A"/>
+                <w:sz w:val="19"/>
+                <w:szCs w:val="19"/>
+              </w:rPr>
+              <w:t xml:space="preserve">Man-Wah Cheers</w:t>
+            </w:r>
+          </w:p>
+        </w:tc>
+        <w:tc>
+          <w:tcPr>
+            <w:tcW w:type="dxa" w:w="0"/>
+            <w:tcBorders>
+              <w:top w:val="single" w:color="D9D3C8" w:sz="2"/>
+              <w:left w:val="none"/>
+              <w:bottom w:val="single" w:color="D9D3C8" w:sz="2"/>
+              <w:right w:val="none"/>
+            </w:tcBorders>
+            <w:tcMar>
+              <w:top w:type="dxa" w:w="70"/>
+              <w:left w:type="dxa" w:w="110"/>
+              <w:bottom w:type="dxa" w:w="70"/>
+              <w:right w:type="dxa" w:w="110"/>
+            </w:tcMar>
+          </w:tcPr>
+          <w:p>
+            <w:pPr>
+              <w:spacing w:after="0"/>
+              <w:jc w:val="right"/>
+            </w:pPr>
+            <w:r>
+              <w:rPr>
+                <w:rFonts w:ascii="Calibri" w:cs="Calibri" w:eastAsia="Calibri" w:hAnsi="Calibri"/>
+                <w:b w:val="false"/>
+                <w:bCs w:val="false"/>
+                <w:color w:val="1F1D1A"/>
+                <w:sz w:val="19"/>
+                <w:szCs w:val="19"/>
+              </w:rPr>
+              <w:t xml:space="preserve">5</w:t>
+            </w:r>
+          </w:p>
+        </w:tc>
+        <w:tc>
+          <w:tcPr>
+            <w:tcW w:type="dxa" w:w="0"/>
+            <w:tcBorders>
+              <w:top w:val="single" w:color="D9D3C8" w:sz="2"/>
+              <w:left w:val="none"/>
+              <w:bottom w:val="single" w:color="D9D3C8" w:sz="2"/>
+              <w:right w:val="none"/>
+            </w:tcBorders>
+            <w:tcMar>
+              <w:top w:type="dxa" w:w="70"/>
+              <w:left w:type="dxa" w:w="110"/>
+              <w:bottom w:type="dxa" w:w="70"/>
+              <w:right w:type="dxa" w:w="110"/>
+            </w:tcMar>
+          </w:tcPr>
+          <w:p>
+            <w:pPr>
+              <w:spacing w:after="0"/>
+              <w:jc w:val="right"/>
+            </w:pPr>
+            <w:r>
+              <w:rPr>
+                <w:rFonts w:ascii="Calibri" w:cs="Calibri" w:eastAsia="Calibri" w:hAnsi="Calibri"/>
+                <w:b w:val="false"/>
+                <w:bCs w:val="false"/>
+                <w:color w:val="1F1D1A"/>
+                <w:sz w:val="19"/>
+                <w:szCs w:val="19"/>
+              </w:rPr>
+              <w:t xml:space="preserve">3%</w:t>
+            </w:r>
+          </w:p>
+        </w:tc>
+        <w:tc>
+          <w:tcPr>
+            <w:tcW w:type="dxa" w:w="0"/>
+            <w:tcBorders>
+              <w:top w:val="single" w:color="D9D3C8" w:sz="2"/>
+              <w:left w:val="none"/>
+              <w:bottom w:val="single" w:color="D9D3C8" w:sz="2"/>
+              <w:right w:val="none"/>
+            </w:tcBorders>
+            <w:tcMar>
+              <w:top w:type="dxa" w:w="70"/>
+              <w:left w:type="dxa" w:w="110"/>
+              <w:bottom w:type="dxa" w:w="70"/>
+              <w:right w:type="dxa" w:w="110"/>
+            </w:tcMar>
+          </w:tcPr>
+          <w:p>
+            <w:pPr>
+              <w:spacing w:after="0"/>
+              <w:jc w:val="right"/>
+            </w:pPr>
+            <w:r>
+              <w:rPr>
+                <w:rFonts w:ascii="Calibri" w:cs="Calibri" w:eastAsia="Calibri" w:hAnsi="Calibri"/>
+                <w:b w:val="false"/>
+                <w:bCs w:val="false"/>
+                <w:color w:val="1F1D1A"/>
+                <w:sz w:val="19"/>
+                <w:szCs w:val="19"/>
+              </w:rPr>
+              <w:t xml:space="preserve">$1,500</w:t>
+            </w:r>
+          </w:p>
+        </w:tc>
+        <w:tc>
+          <w:tcPr>
+            <w:tcW w:type="dxa" w:w="0"/>
+            <w:tcBorders>
+              <w:top w:val="single" w:color="D9D3C8" w:sz="2"/>
+              <w:left w:val="none"/>
+              <w:bottom w:val="single" w:color="D9D3C8" w:sz="2"/>
+              <w:right w:val="none"/>
+            </w:tcBorders>
+            <w:tcMar>
+              <w:top w:type="dxa" w:w="70"/>
+              <w:left w:type="dxa" w:w="110"/>
+              <w:bottom w:type="dxa" w:w="70"/>
+              <w:right w:type="dxa" w:w="110"/>
+            </w:tcMar>
+          </w:tcPr>
+          <w:p>
+            <w:pPr>
+              <w:spacing w:after="0"/>
+              <w:jc w:val="right"/>
+            </w:pPr>
+            <w:r>
+              <w:rPr>
+                <w:rFonts w:ascii="Calibri" w:cs="Calibri" w:eastAsia="Calibri" w:hAnsi="Calibri"/>
+                <w:b w:val="false"/>
+                <w:bCs w:val="false"/>
+                <w:color w:val="1F1D1A"/>
+                <w:sz w:val="19"/>
+                <w:szCs w:val="19"/>
+              </w:rPr>
+              <w:t xml:space="preserve">$1,000</w:t>
+            </w:r>
+          </w:p>
+        </w:tc>
+        <w:tc>
+          <w:tcPr>
+            <w:tcW w:type="dxa" w:w="0"/>
+            <w:tcBorders>
+              <w:top w:val="single" w:color="D9D3C8" w:sz="2"/>
+              <w:left w:val="none"/>
+              <w:bottom w:val="single" w:color="D9D3C8" w:sz="2"/>
+              <w:right w:val="none"/>
+            </w:tcBorders>
+            <w:tcMar>
+              <w:top w:type="dxa" w:w="70"/>
+              <w:left w:type="dxa" w:w="110"/>
+              <w:bottom w:type="dxa" w:w="70"/>
+              <w:right w:type="dxa" w:w="110"/>
+            </w:tcMar>
+          </w:tcPr>
+          <w:p>
+            <w:pPr>
+              <w:spacing w:after="0"/>
+              <w:jc w:val="right"/>
+            </w:pPr>
+            <w:r>
+              <w:rPr>
+                <w:rFonts w:ascii="Calibri" w:cs="Calibri" w:eastAsia="Calibri" w:hAnsi="Calibri"/>
+                <w:b w:val="false"/>
+                <w:bCs w:val="false"/>
+                <w:color w:val="1F1D1A"/>
+                <w:sz w:val="19"/>
+                <w:szCs w:val="19"/>
+              </w:rPr>
+              <w:t xml:space="preserve">33%</w:t>
+            </w:r>
+          </w:p>
+        </w:tc>
+      </w:tr>
+    </w:tbl>
+    <w:p>
+      <w:pPr>
+        <w:spacing w:after="140" w:before="0"/>
+      </w:pPr>
+      <w:r>
+        <w:rPr>
+          <w:rFonts w:ascii="Calibri" w:cs="Calibri" w:eastAsia="Calibri" w:hAnsi="Calibri"/>
+          <w:color w:val="1F1D1A"/>
+          <w:sz w:val="21"/>
+          <w:szCs w:val="21"/>
+        </w:rPr>
+        <w:t xml:space="preserve"/>
+      </w:r>
+    </w:p>
+    <w:tbl>
+      <w:tblPr>
+        <w:tblW w:type="dxa" w:w="9360"/>
+        <w:tblBorders>
+          <w:top w:val="single" w:color="auto" w:sz="4"/>
+          <w:left w:val="single" w:color="auto" w:sz="4"/>
+          <w:bottom w:val="single" w:color="auto" w:sz="4"/>
+          <w:right w:val="single" w:color="auto" w:sz="4"/>
+          <w:insideH w:val="single" w:color="auto" w:sz="4"/>
+          <w:insideV w:val="single" w:color="auto" w:sz="4"/>
+        </w:tblBorders>
+      </w:tblPr>
+      <w:tblGrid>
+        <w:gridCol w:w="2900"/>
+        <w:gridCol w:w="1100"/>
+        <w:gridCol w:w="900"/>
+        <w:gridCol w:w="1500"/>
+        <w:gridCol w:w="1500"/>
+        <w:gridCol w:w="1460"/>
+      </w:tblGrid>
+      <w:tr>
+        <w:trPr>
+          <w:tblHeader/>
+        </w:trPr>
+        <w:tc>
+          <w:tcPr>
+            <w:tcW w:type="dxa" w:w="0"/>
+            <w:tcBorders>
+              <w:top w:val="single" w:color="D9D3C8" w:sz="2"/>
+              <w:left w:val="none"/>
+              <w:bottom w:val="single" w:color="D9D3C8" w:sz="2"/>
+              <w:right w:val="none"/>
+            </w:tcBorders>
+            <w:shd w:fill="F0EBE0" w:color="auto" w:val="clear"/>
+            <w:tcMar>
+              <w:top w:type="dxa" w:w="70"/>
+              <w:left w:type="dxa" w:w="110"/>
+              <w:bottom w:type="dxa" w:w="70"/>
+              <w:right w:type="dxa" w:w="110"/>
+            </w:tcMar>
+          </w:tcPr>
+          <w:p>
+            <w:pPr>
+              <w:spacing w:after="0"/>
+              <w:jc w:val="left"/>
+            </w:pPr>
+            <w:r>
+              <w:rPr>
+                <w:rFonts w:ascii="Calibri" w:cs="Calibri" w:eastAsia="Calibri" w:hAnsi="Calibri"/>
+                <w:b/>
+                <w:bCs/>
+                <w:color w:val="1F1D1A"/>
+                <w:sz w:val="19"/>
+                <w:szCs w:val="19"/>
+              </w:rPr>
+              <w:t xml:space="preserve">Motion sofas — 148 models</w:t>
+            </w:r>
+          </w:p>
+        </w:tc>
+        <w:tc>
+          <w:tcPr>
+            <w:tcW w:type="dxa" w:w="0"/>
+            <w:tcBorders>
+              <w:top w:val="single" w:color="D9D3C8" w:sz="2"/>
+              <w:left w:val="none"/>
+              <w:bottom w:val="single" w:color="D9D3C8" w:sz="2"/>
+              <w:right w:val="none"/>
+            </w:tcBorders>
+            <w:shd w:fill="F0EBE0" w:color="auto" w:val="clear"/>
+            <w:tcMar>
+              <w:top w:type="dxa" w:w="70"/>
+              <w:left w:type="dxa" w:w="110"/>
+              <w:bottom w:type="dxa" w:w="70"/>
+              <w:right w:type="dxa" w:w="110"/>
+            </w:tcMar>
+          </w:tcPr>
+          <w:p>
+            <w:pPr>
+              <w:spacing w:after="0"/>
+              <w:jc w:val="right"/>
+            </w:pPr>
+            <w:r>
+              <w:rPr>
+                <w:rFonts w:ascii="Calibri" w:cs="Calibri" w:eastAsia="Calibri" w:hAnsi="Calibri"/>
+                <w:b/>
+                <w:bCs/>
+                <w:color w:val="1F1D1A"/>
+                <w:sz w:val="19"/>
+                <w:szCs w:val="19"/>
+              </w:rPr>
+              <w:t xml:space="preserve">Models</w:t>
+            </w:r>
+          </w:p>
+        </w:tc>
+        <w:tc>
+          <w:tcPr>
+            <w:tcW w:type="dxa" w:w="0"/>
+            <w:tcBorders>
+              <w:top w:val="single" w:color="D9D3C8" w:sz="2"/>
+              <w:left w:val="none"/>
+              <w:bottom w:val="single" w:color="D9D3C8" w:sz="2"/>
+              <w:right w:val="none"/>
+            </w:tcBorders>
+            <w:shd w:fill="F0EBE0" w:color="auto" w:val="clear"/>
+            <w:tcMar>
+              <w:top w:type="dxa" w:w="70"/>
+              <w:left w:type="dxa" w:w="110"/>
+              <w:bottom w:type="dxa" w:w="70"/>
+              <w:right w:type="dxa" w:w="110"/>
+            </w:tcMar>
+          </w:tcPr>
+          <w:p>
+            <w:pPr>
+              <w:spacing w:after="0"/>
+              <w:jc w:val="right"/>
+            </w:pPr>
+            <w:r>
+              <w:rPr>
+                <w:rFonts w:ascii="Calibri" w:cs="Calibri" w:eastAsia="Calibri" w:hAnsi="Calibri"/>
+                <w:b/>
+                <w:bCs/>
+                <w:color w:val="1F1D1A"/>
+                <w:sz w:val="19"/>
+                <w:szCs w:val="19"/>
+              </w:rPr>
+              <w:t xml:space="preserve">Wall</w:t>
+            </w:r>
+          </w:p>
+        </w:tc>
+        <w:tc>
+          <w:tcPr>
+            <w:tcW w:type="dxa" w:w="0"/>
+            <w:tcBorders>
+              <w:top w:val="single" w:color="D9D3C8" w:sz="2"/>
+              <w:left w:val="none"/>
+              <w:bottom w:val="single" w:color="D9D3C8" w:sz="2"/>
+              <w:right w:val="none"/>
+            </w:tcBorders>
+            <w:shd w:fill="F0EBE0" w:color="auto" w:val="clear"/>
+            <w:tcMar>
+              <w:top w:type="dxa" w:w="70"/>
+              <w:left w:type="dxa" w:w="110"/>
+              <w:bottom w:type="dxa" w:w="70"/>
+              <w:right w:type="dxa" w:w="110"/>
+            </w:tcMar>
+          </w:tcPr>
+          <w:p>
+            <w:pPr>
+              <w:spacing w:after="0"/>
+              <w:jc w:val="right"/>
+            </w:pPr>
+            <w:r>
+              <w:rPr>
+                <w:rFonts w:ascii="Calibri" w:cs="Calibri" w:eastAsia="Calibri" w:hAnsi="Calibri"/>
+                <w:b/>
+                <w:bCs/>
+                <w:color w:val="1F1D1A"/>
+                <w:sz w:val="19"/>
+                <w:szCs w:val="19"/>
+              </w:rPr>
+              <w:t xml:space="preserve">List</w:t>
+            </w:r>
+          </w:p>
+        </w:tc>
+        <w:tc>
+          <w:tcPr>
+            <w:tcW w:type="dxa" w:w="0"/>
+            <w:tcBorders>
+              <w:top w:val="single" w:color="D9D3C8" w:sz="2"/>
+              <w:left w:val="none"/>
+              <w:bottom w:val="single" w:color="D9D3C8" w:sz="2"/>
+              <w:right w:val="none"/>
+            </w:tcBorders>
+            <w:shd w:fill="F0EBE0" w:color="auto" w:val="clear"/>
+            <w:tcMar>
+              <w:top w:type="dxa" w:w="70"/>
+              <w:left w:type="dxa" w:w="110"/>
+              <w:bottom w:type="dxa" w:w="70"/>
+              <w:right w:type="dxa" w:w="110"/>
+            </w:tcMar>
+          </w:tcPr>
+          <w:p>
+            <w:pPr>
+              <w:spacing w:after="0"/>
+              <w:jc w:val="right"/>
+            </w:pPr>
+            <w:r>
+              <w:rPr>
+                <w:rFonts w:ascii="Calibri" w:cs="Calibri" w:eastAsia="Calibri" w:hAnsi="Calibri"/>
+                <w:b/>
+                <w:bCs/>
+                <w:color w:val="1F1D1A"/>
+                <w:sz w:val="19"/>
+                <w:szCs w:val="19"/>
+              </w:rPr>
+              <w:t xml:space="preserve">Entry</w:t>
+            </w:r>
+          </w:p>
+        </w:tc>
+        <w:tc>
+          <w:tcPr>
+            <w:tcW w:type="dxa" w:w="0"/>
+            <w:tcBorders>
+              <w:top w:val="single" w:color="D9D3C8" w:sz="2"/>
+              <w:left w:val="none"/>
+              <w:bottom w:val="single" w:color="D9D3C8" w:sz="2"/>
+              <w:right w:val="none"/>
+            </w:tcBorders>
+            <w:shd w:fill="F0EBE0" w:color="auto" w:val="clear"/>
+            <w:tcMar>
+              <w:top w:type="dxa" w:w="70"/>
+              <w:left w:type="dxa" w:w="110"/>
+              <w:bottom w:type="dxa" w:w="70"/>
+              <w:right w:type="dxa" w:w="110"/>
+            </w:tcMar>
+          </w:tcPr>
+          <w:p>
+            <w:pPr>
+              <w:spacing w:after="0"/>
+              <w:jc w:val="right"/>
+            </w:pPr>
+            <w:r>
+              <w:rPr>
+                <w:rFonts w:ascii="Calibri" w:cs="Calibri" w:eastAsia="Calibri" w:hAnsi="Calibri"/>
+                <w:b/>
+                <w:bCs/>
+                <w:color w:val="1F1D1A"/>
+                <w:sz w:val="19"/>
+                <w:szCs w:val="19"/>
+              </w:rPr>
+              <w:t xml:space="preserve">Disc</w:t>
+            </w:r>
+          </w:p>
+        </w:tc>
+      </w:tr>
+      <w:tr>
+        <w:tc>
+          <w:tcPr>
+            <w:tcW w:type="dxa" w:w="0"/>
+            <w:tcBorders>
+              <w:top w:val="single" w:color="D9D3C8" w:sz="2"/>
+              <w:left w:val="none"/>
+              <w:bottom w:val="single" w:color="D9D3C8" w:sz="2"/>
+              <w:right w:val="none"/>
+            </w:tcBorders>
+            <w:tcMar>
+              <w:top w:type="dxa" w:w="70"/>
+              <w:left w:type="dxa" w:w="110"/>
+              <w:bottom w:type="dxa" w:w="70"/>
+              <w:right w:type="dxa" w:w="110"/>
+            </w:tcMar>
+          </w:tcPr>
+          <w:p>
+            <w:pPr>
+              <w:spacing w:after="0"/>
+              <w:jc w:val="left"/>
+            </w:pPr>
+            <w:r>
+              <w:rPr>
+                <w:rFonts w:ascii="Calibri" w:cs="Calibri" w:eastAsia="Calibri" w:hAnsi="Calibri"/>
+                <w:b w:val="false"/>
+                <w:bCs w:val="false"/>
+                <w:color w:val="1F1D1A"/>
+                <w:sz w:val="19"/>
+                <w:szCs w:val="19"/>
+              </w:rPr>
+              <w:t xml:space="preserve">La-Z-Boy</w:t>
+            </w:r>
+          </w:p>
+        </w:tc>
+        <w:tc>
+          <w:tcPr>
+            <w:tcW w:type="dxa" w:w="0"/>
+            <w:tcBorders>
+              <w:top w:val="single" w:color="D9D3C8" w:sz="2"/>
+              <w:left w:val="none"/>
+              <w:bottom w:val="single" w:color="D9D3C8" w:sz="2"/>
+              <w:right w:val="none"/>
+            </w:tcBorders>
+            <w:tcMar>
+              <w:top w:type="dxa" w:w="70"/>
+              <w:left w:type="dxa" w:w="110"/>
+              <w:bottom w:type="dxa" w:w="70"/>
+              <w:right w:type="dxa" w:w="110"/>
+            </w:tcMar>
+          </w:tcPr>
+          <w:p>
+            <w:pPr>
+              <w:spacing w:after="0"/>
+              <w:jc w:val="right"/>
+            </w:pPr>
+            <w:r>
+              <w:rPr>
+                <w:rFonts w:ascii="Calibri" w:cs="Calibri" w:eastAsia="Calibri" w:hAnsi="Calibri"/>
+                <w:b w:val="false"/>
+                <w:bCs w:val="false"/>
+                <w:color w:val="1F1D1A"/>
+                <w:sz w:val="19"/>
+                <w:szCs w:val="19"/>
+              </w:rPr>
+              <w:t xml:space="preserve">56</w:t>
+            </w:r>
+          </w:p>
+        </w:tc>
+        <w:tc>
+          <w:tcPr>
+            <w:tcW w:type="dxa" w:w="0"/>
+            <w:tcBorders>
+              <w:top w:val="single" w:color="D9D3C8" w:sz="2"/>
+              <w:left w:val="none"/>
+              <w:bottom w:val="single" w:color="D9D3C8" w:sz="2"/>
+              <w:right w:val="none"/>
+            </w:tcBorders>
+            <w:tcMar>
+              <w:top w:type="dxa" w:w="70"/>
+              <w:left w:type="dxa" w:w="110"/>
+              <w:bottom w:type="dxa" w:w="70"/>
+              <w:right w:type="dxa" w:w="110"/>
+            </w:tcMar>
+          </w:tcPr>
+          <w:p>
+            <w:pPr>
+              <w:spacing w:after="0"/>
+              <w:jc w:val="right"/>
+            </w:pPr>
+            <w:r>
+              <w:rPr>
+                <w:rFonts w:ascii="Calibri" w:cs="Calibri" w:eastAsia="Calibri" w:hAnsi="Calibri"/>
+                <w:b w:val="false"/>
+                <w:bCs w:val="false"/>
+                <w:color w:val="1F1D1A"/>
+                <w:sz w:val="19"/>
+                <w:szCs w:val="19"/>
+              </w:rPr>
+              <w:t xml:space="preserve">38%</w:t>
+            </w:r>
+          </w:p>
+        </w:tc>
+        <w:tc>
+          <w:tcPr>
+            <w:tcW w:type="dxa" w:w="0"/>
+            <w:tcBorders>
+              <w:top w:val="single" w:color="D9D3C8" w:sz="2"/>
+              <w:left w:val="none"/>
+              <w:bottom w:val="single" w:color="D9D3C8" w:sz="2"/>
+              <w:right w:val="none"/>
+            </w:tcBorders>
+            <w:tcMar>
+              <w:top w:type="dxa" w:w="70"/>
+              <w:left w:type="dxa" w:w="110"/>
+              <w:bottom w:type="dxa" w:w="70"/>
+              <w:right w:type="dxa" w:w="110"/>
+            </w:tcMar>
+          </w:tcPr>
+          <w:p>
+            <w:pPr>
+              <w:spacing w:after="0"/>
+              <w:jc w:val="right"/>
+            </w:pPr>
+            <w:r>
+              <w:rPr>
+                <w:rFonts w:ascii="Calibri" w:cs="Calibri" w:eastAsia="Calibri" w:hAnsi="Calibri"/>
+                <w:b w:val="false"/>
+                <w:bCs w:val="false"/>
+                <w:color w:val="1F1D1A"/>
+                <w:sz w:val="19"/>
+                <w:szCs w:val="19"/>
+              </w:rPr>
+              <w:t xml:space="preserve">$3,925</w:t>
+            </w:r>
+          </w:p>
+        </w:tc>
+        <w:tc>
+          <w:tcPr>
+            <w:tcW w:type="dxa" w:w="0"/>
+            <w:tcBorders>
+              <w:top w:val="single" w:color="D9D3C8" w:sz="2"/>
+              <w:left w:val="none"/>
+              <w:bottom w:val="single" w:color="D9D3C8" w:sz="2"/>
+              <w:right w:val="none"/>
+            </w:tcBorders>
+            <w:tcMar>
+              <w:top w:type="dxa" w:w="70"/>
+              <w:left w:type="dxa" w:w="110"/>
+              <w:bottom w:type="dxa" w:w="70"/>
+              <w:right w:type="dxa" w:w="110"/>
+            </w:tcMar>
+          </w:tcPr>
+          <w:p>
+            <w:pPr>
+              <w:spacing w:after="0"/>
+              <w:jc w:val="right"/>
+            </w:pPr>
+            <w:r>
+              <w:rPr>
+                <w:rFonts w:ascii="Calibri" w:cs="Calibri" w:eastAsia="Calibri" w:hAnsi="Calibri"/>
+                <w:b w:val="false"/>
+                <w:bCs w:val="false"/>
+                <w:color w:val="1F1D1A"/>
+                <w:sz w:val="19"/>
+                <w:szCs w:val="19"/>
+              </w:rPr>
+              <w:t xml:space="preserve">$2,290</w:t>
+            </w:r>
+          </w:p>
+        </w:tc>
+        <w:tc>
+          <w:tcPr>
+            <w:tcW w:type="dxa" w:w="0"/>
+            <w:tcBorders>
+              <w:top w:val="single" w:color="D9D3C8" w:sz="2"/>
+              <w:left w:val="none"/>
+              <w:bottom w:val="single" w:color="D9D3C8" w:sz="2"/>
+              <w:right w:val="none"/>
+            </w:tcBorders>
+            <w:tcMar>
+              <w:top w:type="dxa" w:w="70"/>
+              <w:left w:type="dxa" w:w="110"/>
+              <w:bottom w:type="dxa" w:w="70"/>
+              <w:right w:type="dxa" w:w="110"/>
+            </w:tcMar>
+          </w:tcPr>
+          <w:p>
+            <w:pPr>
+              <w:spacing w:after="0"/>
+              <w:jc w:val="right"/>
+            </w:pPr>
+            <w:r>
+              <w:rPr>
+                <w:rFonts w:ascii="Calibri" w:cs="Calibri" w:eastAsia="Calibri" w:hAnsi="Calibri"/>
+                <w:b w:val="false"/>
+                <w:bCs w:val="false"/>
+                <w:color w:val="1F1D1A"/>
+                <w:sz w:val="19"/>
+                <w:szCs w:val="19"/>
+              </w:rPr>
+              <w:t xml:space="preserve">42%</w:t>
+            </w:r>
+          </w:p>
+        </w:tc>
+      </w:tr>
+      <w:tr>
+        <w:tc>
+          <w:tcPr>
+            <w:tcW w:type="dxa" w:w="0"/>
+            <w:tcBorders>
+              <w:top w:val="single" w:color="D9D3C8" w:sz="2"/>
+              <w:left w:val="none"/>
+              <w:bottom w:val="single" w:color="D9D3C8" w:sz="2"/>
+              <w:right w:val="none"/>
+            </w:tcBorders>
+            <w:tcMar>
+              <w:top w:type="dxa" w:w="70"/>
+              <w:left w:type="dxa" w:w="110"/>
+              <w:bottom w:type="dxa" w:w="70"/>
+              <w:right w:type="dxa" w:w="110"/>
+            </w:tcMar>
+          </w:tcPr>
+          <w:p>
+            <w:pPr>
+              <w:spacing w:after="0"/>
+              <w:jc w:val="left"/>
+            </w:pPr>
+            <w:r>
+              <w:rPr>
+                <w:rFonts w:ascii="Calibri" w:cs="Calibri" w:eastAsia="Calibri" w:hAnsi="Calibri"/>
+                <w:b w:val="false"/>
+                <w:bCs w:val="false"/>
+                <w:color w:val="1F1D1A"/>
+                <w:sz w:val="19"/>
+                <w:szCs w:val="19"/>
+              </w:rPr>
+              <w:t xml:space="preserve">Ashley</w:t>
+            </w:r>
+          </w:p>
+        </w:tc>
+        <w:tc>
+          <w:tcPr>
+            <w:tcW w:type="dxa" w:w="0"/>
+            <w:tcBorders>
+              <w:top w:val="single" w:color="D9D3C8" w:sz="2"/>
+              <w:left w:val="none"/>
+              <w:bottom w:val="single" w:color="D9D3C8" w:sz="2"/>
+              <w:right w:val="none"/>
+            </w:tcBorders>
+            <w:tcMar>
+              <w:top w:type="dxa" w:w="70"/>
+              <w:left w:type="dxa" w:w="110"/>
+              <w:bottom w:type="dxa" w:w="70"/>
+              <w:right w:type="dxa" w:w="110"/>
+            </w:tcMar>
+          </w:tcPr>
+          <w:p>
+            <w:pPr>
+              <w:spacing w:after="0"/>
+              <w:jc w:val="right"/>
+            </w:pPr>
+            <w:r>
+              <w:rPr>
+                <w:rFonts w:ascii="Calibri" w:cs="Calibri" w:eastAsia="Calibri" w:hAnsi="Calibri"/>
+                <w:b w:val="false"/>
+                <w:bCs w:val="false"/>
+                <w:color w:val="1F1D1A"/>
+                <w:sz w:val="19"/>
+                <w:szCs w:val="19"/>
+              </w:rPr>
+              <w:t xml:space="preserve">31</w:t>
+            </w:r>
+          </w:p>
+        </w:tc>
+        <w:tc>
+          <w:tcPr>
+            <w:tcW w:type="dxa" w:w="0"/>
+            <w:tcBorders>
+              <w:top w:val="single" w:color="D9D3C8" w:sz="2"/>
+              <w:left w:val="none"/>
+              <w:bottom w:val="single" w:color="D9D3C8" w:sz="2"/>
+              <w:right w:val="none"/>
+            </w:tcBorders>
+            <w:tcMar>
+              <w:top w:type="dxa" w:w="70"/>
+              <w:left w:type="dxa" w:w="110"/>
+              <w:bottom w:type="dxa" w:w="70"/>
+              <w:right w:type="dxa" w:w="110"/>
+            </w:tcMar>
+          </w:tcPr>
+          <w:p>
+            <w:pPr>
+              <w:spacing w:after="0"/>
+              <w:jc w:val="right"/>
+            </w:pPr>
+            <w:r>
+              <w:rPr>
+                <w:rFonts w:ascii="Calibri" w:cs="Calibri" w:eastAsia="Calibri" w:hAnsi="Calibri"/>
+                <w:b w:val="false"/>
+                <w:bCs w:val="false"/>
+                <w:color w:val="1F1D1A"/>
+                <w:sz w:val="19"/>
+                <w:szCs w:val="19"/>
+              </w:rPr>
+              <w:t xml:space="preserve">21%</w:t>
+            </w:r>
+          </w:p>
+        </w:tc>
+        <w:tc>
+          <w:tcPr>
+            <w:tcW w:type="dxa" w:w="0"/>
+            <w:tcBorders>
+              <w:top w:val="single" w:color="D9D3C8" w:sz="2"/>
+              <w:left w:val="none"/>
+              <w:bottom w:val="single" w:color="D9D3C8" w:sz="2"/>
+              <w:right w:val="none"/>
+            </w:tcBorders>
+            <w:tcMar>
+              <w:top w:type="dxa" w:w="70"/>
+              <w:left w:type="dxa" w:w="110"/>
+              <w:bottom w:type="dxa" w:w="70"/>
+              <w:right w:type="dxa" w:w="110"/>
+            </w:tcMar>
+          </w:tcPr>
+          <w:p>
+            <w:pPr>
+              <w:spacing w:after="0"/>
+              <w:jc w:val="right"/>
+            </w:pPr>
+            <w:r>
+              <w:rPr>
+                <w:rFonts w:ascii="Calibri" w:cs="Calibri" w:eastAsia="Calibri" w:hAnsi="Calibri"/>
+                <w:b w:val="false"/>
+                <w:bCs w:val="false"/>
+                <w:color w:val="1F1D1A"/>
+                <w:sz w:val="19"/>
+                <w:szCs w:val="19"/>
+              </w:rPr>
+              <w:t xml:space="preserve">$1,600</w:t>
+            </w:r>
+          </w:p>
+        </w:tc>
+        <w:tc>
+          <w:tcPr>
+            <w:tcW w:type="dxa" w:w="0"/>
+            <w:tcBorders>
+              <w:top w:val="single" w:color="D9D3C8" w:sz="2"/>
+              <w:left w:val="none"/>
+              <w:bottom w:val="single" w:color="D9D3C8" w:sz="2"/>
+              <w:right w:val="none"/>
+            </w:tcBorders>
+            <w:tcMar>
+              <w:top w:type="dxa" w:w="70"/>
+              <w:left w:type="dxa" w:w="110"/>
+              <w:bottom w:type="dxa" w:w="70"/>
+              <w:right w:type="dxa" w:w="110"/>
+            </w:tcMar>
+          </w:tcPr>
+          <w:p>
+            <w:pPr>
+              <w:spacing w:after="0"/>
+              <w:jc w:val="right"/>
+            </w:pPr>
+            <w:r>
+              <w:rPr>
+                <w:rFonts w:ascii="Calibri" w:cs="Calibri" w:eastAsia="Calibri" w:hAnsi="Calibri"/>
+                <w:b w:val="false"/>
+                <w:bCs w:val="false"/>
+                <w:color w:val="1F1D1A"/>
+                <w:sz w:val="19"/>
+                <w:szCs w:val="19"/>
+              </w:rPr>
+              <w:t xml:space="preserve">$1,200</w:t>
+            </w:r>
+          </w:p>
+        </w:tc>
+        <w:tc>
+          <w:tcPr>
+            <w:tcW w:type="dxa" w:w="0"/>
+            <w:tcBorders>
+              <w:top w:val="single" w:color="D9D3C8" w:sz="2"/>
+              <w:left w:val="none"/>
+              <w:bottom w:val="single" w:color="D9D3C8" w:sz="2"/>
+              <w:right w:val="none"/>
+            </w:tcBorders>
+            <w:tcMar>
+              <w:top w:type="dxa" w:w="70"/>
+              <w:left w:type="dxa" w:w="110"/>
+              <w:bottom w:type="dxa" w:w="70"/>
+              <w:right w:type="dxa" w:w="110"/>
+            </w:tcMar>
+          </w:tcPr>
+          <w:p>
+            <w:pPr>
+              <w:spacing w:after="0"/>
+              <w:jc w:val="right"/>
+            </w:pPr>
+            <w:r>
+              <w:rPr>
+                <w:rFonts w:ascii="Calibri" w:cs="Calibri" w:eastAsia="Calibri" w:hAnsi="Calibri"/>
+                <w:b w:val="false"/>
+                <w:bCs w:val="false"/>
+                <w:color w:val="1F1D1A"/>
+                <w:sz w:val="19"/>
+                <w:szCs w:val="19"/>
+              </w:rPr>
+              <w:t xml:space="preserve">33%</w:t>
+            </w:r>
+          </w:p>
+        </w:tc>
+      </w:tr>
+      <w:tr>
+        <w:tc>
+          <w:tcPr>
+            <w:tcW w:type="dxa" w:w="0"/>
+            <w:tcBorders>
+              <w:top w:val="single" w:color="D9D3C8" w:sz="2"/>
+              <w:left w:val="none"/>
+              <w:bottom w:val="single" w:color="D9D3C8" w:sz="2"/>
+              <w:right w:val="none"/>
+            </w:tcBorders>
+            <w:tcMar>
+              <w:top w:type="dxa" w:w="70"/>
+              <w:left w:type="dxa" w:w="110"/>
+              <w:bottom w:type="dxa" w:w="70"/>
+              <w:right w:type="dxa" w:w="110"/>
+            </w:tcMar>
+          </w:tcPr>
+          <w:p>
+            <w:pPr>
+              <w:spacing w:after="0"/>
+              <w:jc w:val="left"/>
+            </w:pPr>
+            <w:r>
+              <w:rPr>
+                <w:rFonts w:ascii="Calibri" w:cs="Calibri" w:eastAsia="Calibri" w:hAnsi="Calibri"/>
+                <w:b w:val="false"/>
+                <w:bCs w:val="false"/>
+                <w:color w:val="1F1D1A"/>
+                <w:sz w:val="19"/>
+                <w:szCs w:val="19"/>
+              </w:rPr>
+              <w:t xml:space="preserve">Southern Motion</w:t>
+            </w:r>
+          </w:p>
+        </w:tc>
+        <w:tc>
+          <w:tcPr>
+            <w:tcW w:type="dxa" w:w="0"/>
+            <w:tcBorders>
+              <w:top w:val="single" w:color="D9D3C8" w:sz="2"/>
+              <w:left w:val="none"/>
+              <w:bottom w:val="single" w:color="D9D3C8" w:sz="2"/>
+              <w:right w:val="none"/>
+            </w:tcBorders>
+            <w:tcMar>
+              <w:top w:type="dxa" w:w="70"/>
+              <w:left w:type="dxa" w:w="110"/>
+              <w:bottom w:type="dxa" w:w="70"/>
+              <w:right w:type="dxa" w:w="110"/>
+            </w:tcMar>
+          </w:tcPr>
+          <w:p>
+            <w:pPr>
+              <w:spacing w:after="0"/>
+              <w:jc w:val="right"/>
+            </w:pPr>
+            <w:r>
+              <w:rPr>
+                <w:rFonts w:ascii="Calibri" w:cs="Calibri" w:eastAsia="Calibri" w:hAnsi="Calibri"/>
+                <w:b w:val="false"/>
+                <w:bCs w:val="false"/>
+                <w:color w:val="1F1D1A"/>
+                <w:sz w:val="19"/>
+                <w:szCs w:val="19"/>
+              </w:rPr>
+              <w:t xml:space="preserve">28</w:t>
+            </w:r>
+          </w:p>
+        </w:tc>
+        <w:tc>
+          <w:tcPr>
+            <w:tcW w:type="dxa" w:w="0"/>
+            <w:tcBorders>
+              <w:top w:val="single" w:color="D9D3C8" w:sz="2"/>
+              <w:left w:val="none"/>
+              <w:bottom w:val="single" w:color="D9D3C8" w:sz="2"/>
+              <w:right w:val="none"/>
+            </w:tcBorders>
+            <w:tcMar>
+              <w:top w:type="dxa" w:w="70"/>
+              <w:left w:type="dxa" w:w="110"/>
+              <w:bottom w:type="dxa" w:w="70"/>
+              <w:right w:type="dxa" w:w="110"/>
+            </w:tcMar>
+          </w:tcPr>
+          <w:p>
+            <w:pPr>
+              <w:spacing w:after="0"/>
+              <w:jc w:val="right"/>
+            </w:pPr>
+            <w:r>
+              <w:rPr>
+                <w:rFonts w:ascii="Calibri" w:cs="Calibri" w:eastAsia="Calibri" w:hAnsi="Calibri"/>
+                <w:b w:val="false"/>
+                <w:bCs w:val="false"/>
+                <w:color w:val="1F1D1A"/>
+                <w:sz w:val="19"/>
+                <w:szCs w:val="19"/>
+              </w:rPr>
+              <w:t xml:space="preserve">19%</w:t>
+            </w:r>
+          </w:p>
+        </w:tc>
+        <w:tc>
+          <w:tcPr>
+            <w:tcW w:type="dxa" w:w="0"/>
+            <w:tcBorders>
+              <w:top w:val="single" w:color="D9D3C8" w:sz="2"/>
+              <w:left w:val="none"/>
+              <w:bottom w:val="single" w:color="D9D3C8" w:sz="2"/>
+              <w:right w:val="none"/>
+            </w:tcBorders>
+            <w:tcMar>
+              <w:top w:type="dxa" w:w="70"/>
+              <w:left w:type="dxa" w:w="110"/>
+              <w:bottom w:type="dxa" w:w="70"/>
+              <w:right w:type="dxa" w:w="110"/>
+            </w:tcMar>
+          </w:tcPr>
+          <w:p>
+            <w:pPr>
+              <w:spacing w:after="0"/>
+              <w:jc w:val="right"/>
+            </w:pPr>
+            <w:r>
+              <w:rPr>
+                <w:rFonts w:ascii="Calibri" w:cs="Calibri" w:eastAsia="Calibri" w:hAnsi="Calibri"/>
+                <w:b w:val="false"/>
+                <w:bCs w:val="false"/>
+                <w:color w:val="1F1D1A"/>
+                <w:sz w:val="19"/>
+                <w:szCs w:val="19"/>
+              </w:rPr>
+              <w:t xml:space="preserve">$3,250</w:t>
+            </w:r>
+          </w:p>
+        </w:tc>
+        <w:tc>
+          <w:tcPr>
+            <w:tcW w:type="dxa" w:w="0"/>
+            <w:tcBorders>
+              <w:top w:val="single" w:color="D9D3C8" w:sz="2"/>
+              <w:left w:val="none"/>
+              <w:bottom w:val="single" w:color="D9D3C8" w:sz="2"/>
+              <w:right w:val="none"/>
+            </w:tcBorders>
+            <w:tcMar>
+              <w:top w:type="dxa" w:w="70"/>
+              <w:left w:type="dxa" w:w="110"/>
+              <w:bottom w:type="dxa" w:w="70"/>
+              <w:right w:type="dxa" w:w="110"/>
+            </w:tcMar>
+          </w:tcPr>
+          <w:p>
+            <w:pPr>
+              <w:spacing w:after="0"/>
+              <w:jc w:val="right"/>
+            </w:pPr>
+            <w:r>
+              <w:rPr>
+                <w:rFonts w:ascii="Calibri" w:cs="Calibri" w:eastAsia="Calibri" w:hAnsi="Calibri"/>
+                <w:b w:val="false"/>
+                <w:bCs w:val="false"/>
+                <w:color w:val="1F1D1A"/>
+                <w:sz w:val="19"/>
+                <w:szCs w:val="19"/>
+              </w:rPr>
+              <w:t xml:space="preserve">$2,040</w:t>
+            </w:r>
+          </w:p>
+        </w:tc>
+        <w:tc>
+          <w:tcPr>
+            <w:tcW w:type="dxa" w:w="0"/>
+            <w:tcBorders>
+              <w:top w:val="single" w:color="D9D3C8" w:sz="2"/>
+              <w:left w:val="none"/>
+              <w:bottom w:val="single" w:color="D9D3C8" w:sz="2"/>
+              <w:right w:val="none"/>
+            </w:tcBorders>
+            <w:tcMar>
+              <w:top w:type="dxa" w:w="70"/>
+              <w:left w:type="dxa" w:w="110"/>
+              <w:bottom w:type="dxa" w:w="70"/>
+              <w:right w:type="dxa" w:w="110"/>
+            </w:tcMar>
+          </w:tcPr>
+          <w:p>
+            <w:pPr>
+              <w:spacing w:after="0"/>
+              <w:jc w:val="right"/>
+            </w:pPr>
+            <w:r>
+              <w:rPr>
+                <w:rFonts w:ascii="Calibri" w:cs="Calibri" w:eastAsia="Calibri" w:hAnsi="Calibri"/>
+                <w:b w:val="false"/>
+                <w:bCs w:val="false"/>
+                <w:color w:val="1F1D1A"/>
+                <w:sz w:val="19"/>
+                <w:szCs w:val="19"/>
+              </w:rPr>
+              <w:t xml:space="preserve">34%</w:t>
+            </w:r>
+          </w:p>
+        </w:tc>
+      </w:tr>
+      <w:tr>
+        <w:tc>
+          <w:tcPr>
+            <w:tcW w:type="dxa" w:w="0"/>
+            <w:tcBorders>
+              <w:top w:val="single" w:color="D9D3C8" w:sz="2"/>
+              <w:left w:val="none"/>
+              <w:bottom w:val="single" w:color="D9D3C8" w:sz="2"/>
+              <w:right w:val="none"/>
+            </w:tcBorders>
+            <w:tcMar>
+              <w:top w:type="dxa" w:w="70"/>
+              <w:left w:type="dxa" w:w="110"/>
+              <w:bottom w:type="dxa" w:w="70"/>
+              <w:right w:type="dxa" w:w="110"/>
+            </w:tcMar>
+          </w:tcPr>
+          <w:p>
+            <w:pPr>
+              <w:spacing w:after="0"/>
+              <w:jc w:val="left"/>
+            </w:pPr>
+            <w:r>
+              <w:rPr>
+                <w:rFonts w:ascii="Calibri" w:cs="Calibri" w:eastAsia="Calibri" w:hAnsi="Calibri"/>
+                <w:b w:val="false"/>
+                <w:bCs w:val="false"/>
+                <w:color w:val="1F1D1A"/>
+                <w:sz w:val="19"/>
+                <w:szCs w:val="19"/>
+              </w:rPr>
+              <w:t xml:space="preserve">Flexsteel</w:t>
+            </w:r>
+          </w:p>
+        </w:tc>
+        <w:tc>
+          <w:tcPr>
+            <w:tcW w:type="dxa" w:w="0"/>
+            <w:tcBorders>
+              <w:top w:val="single" w:color="D9D3C8" w:sz="2"/>
+              <w:left w:val="none"/>
+              <w:bottom w:val="single" w:color="D9D3C8" w:sz="2"/>
+              <w:right w:val="none"/>
+            </w:tcBorders>
+            <w:tcMar>
+              <w:top w:type="dxa" w:w="70"/>
+              <w:left w:type="dxa" w:w="110"/>
+              <w:bottom w:type="dxa" w:w="70"/>
+              <w:right w:type="dxa" w:w="110"/>
+            </w:tcMar>
+          </w:tcPr>
+          <w:p>
+            <w:pPr>
+              <w:spacing w:after="0"/>
+              <w:jc w:val="right"/>
+            </w:pPr>
+            <w:r>
+              <w:rPr>
+                <w:rFonts w:ascii="Calibri" w:cs="Calibri" w:eastAsia="Calibri" w:hAnsi="Calibri"/>
+                <w:b w:val="false"/>
+                <w:bCs w:val="false"/>
+                <w:color w:val="1F1D1A"/>
+                <w:sz w:val="19"/>
+                <w:szCs w:val="19"/>
+              </w:rPr>
+              <w:t xml:space="preserve">10</w:t>
+            </w:r>
+          </w:p>
+        </w:tc>
+        <w:tc>
+          <w:tcPr>
+            <w:tcW w:type="dxa" w:w="0"/>
+            <w:tcBorders>
+              <w:top w:val="single" w:color="D9D3C8" w:sz="2"/>
+              <w:left w:val="none"/>
+              <w:bottom w:val="single" w:color="D9D3C8" w:sz="2"/>
+              <w:right w:val="none"/>
+            </w:tcBorders>
+            <w:tcMar>
+              <w:top w:type="dxa" w:w="70"/>
+              <w:left w:type="dxa" w:w="110"/>
+              <w:bottom w:type="dxa" w:w="70"/>
+              <w:right w:type="dxa" w:w="110"/>
+            </w:tcMar>
+          </w:tcPr>
+          <w:p>
+            <w:pPr>
+              <w:spacing w:after="0"/>
+              <w:jc w:val="right"/>
+            </w:pPr>
+            <w:r>
+              <w:rPr>
+                <w:rFonts w:ascii="Calibri" w:cs="Calibri" w:eastAsia="Calibri" w:hAnsi="Calibri"/>
+                <w:b w:val="false"/>
+                <w:bCs w:val="false"/>
+                <w:color w:val="1F1D1A"/>
+                <w:sz w:val="19"/>
+                <w:szCs w:val="19"/>
+              </w:rPr>
+              <w:t xml:space="preserve">7%</w:t>
+            </w:r>
+          </w:p>
+        </w:tc>
+        <w:tc>
+          <w:tcPr>
+            <w:tcW w:type="dxa" w:w="0"/>
+            <w:tcBorders>
+              <w:top w:val="single" w:color="D9D3C8" w:sz="2"/>
+              <w:left w:val="none"/>
+              <w:bottom w:val="single" w:color="D9D3C8" w:sz="2"/>
+              <w:right w:val="none"/>
+            </w:tcBorders>
+            <w:tcMar>
+              <w:top w:type="dxa" w:w="70"/>
+              <w:left w:type="dxa" w:w="110"/>
+              <w:bottom w:type="dxa" w:w="70"/>
+              <w:right w:type="dxa" w:w="110"/>
+            </w:tcMar>
+          </w:tcPr>
+          <w:p>
+            <w:pPr>
+              <w:spacing w:after="0"/>
+              <w:jc w:val="right"/>
+            </w:pPr>
+            <w:r>
+              <w:rPr>
+                <w:rFonts w:ascii="Calibri" w:cs="Calibri" w:eastAsia="Calibri" w:hAnsi="Calibri"/>
+                <w:b w:val="false"/>
+                <w:bCs w:val="false"/>
+                <w:color w:val="1F1D1A"/>
+                <w:sz w:val="19"/>
+                <w:szCs w:val="19"/>
+              </w:rPr>
+              <w:t xml:space="preserve">$5,400</w:t>
+            </w:r>
+          </w:p>
+        </w:tc>
+        <w:tc>
+          <w:tcPr>
+            <w:tcW w:type="dxa" w:w="0"/>
+            <w:tcBorders>
+              <w:top w:val="single" w:color="D9D3C8" w:sz="2"/>
+              <w:left w:val="none"/>
+              <w:bottom w:val="single" w:color="D9D3C8" w:sz="2"/>
+              <w:right w:val="none"/>
+            </w:tcBorders>
+            <w:tcMar>
+              <w:top w:type="dxa" w:w="70"/>
+              <w:left w:type="dxa" w:w="110"/>
+              <w:bottom w:type="dxa" w:w="70"/>
+              <w:right w:type="dxa" w:w="110"/>
+            </w:tcMar>
+          </w:tcPr>
+          <w:p>
+            <w:pPr>
+              <w:spacing w:after="0"/>
+              <w:jc w:val="right"/>
+            </w:pPr>
+            <w:r>
+              <w:rPr>
+                <w:rFonts w:ascii="Calibri" w:cs="Calibri" w:eastAsia="Calibri" w:hAnsi="Calibri"/>
+                <w:b w:val="false"/>
+                <w:bCs w:val="false"/>
+                <w:color w:val="1F1D1A"/>
+                <w:sz w:val="19"/>
+                <w:szCs w:val="19"/>
+              </w:rPr>
+              <w:t xml:space="preserve">$3,600</w:t>
+            </w:r>
+          </w:p>
+        </w:tc>
+        <w:tc>
+          <w:tcPr>
+            <w:tcW w:type="dxa" w:w="0"/>
+            <w:tcBorders>
+              <w:top w:val="single" w:color="D9D3C8" w:sz="2"/>
+              <w:left w:val="none"/>
+              <w:bottom w:val="single" w:color="D9D3C8" w:sz="2"/>
+              <w:right w:val="none"/>
+            </w:tcBorders>
+            <w:tcMar>
+              <w:top w:type="dxa" w:w="70"/>
+              <w:left w:type="dxa" w:w="110"/>
+              <w:bottom w:type="dxa" w:w="70"/>
+              <w:right w:type="dxa" w:w="110"/>
+            </w:tcMar>
+          </w:tcPr>
+          <w:p>
+            <w:pPr>
+              <w:spacing w:after="0"/>
+              <w:jc w:val="right"/>
+            </w:pPr>
+            <w:r>
+              <w:rPr>
+                <w:rFonts w:ascii="Calibri" w:cs="Calibri" w:eastAsia="Calibri" w:hAnsi="Calibri"/>
+                <w:b w:val="false"/>
+                <w:bCs w:val="false"/>
+                <w:color w:val="1F1D1A"/>
+                <w:sz w:val="19"/>
+                <w:szCs w:val="19"/>
+              </w:rPr>
+              <w:t xml:space="preserve">33%</w:t>
+            </w:r>
+          </w:p>
+        </w:tc>
+      </w:tr>
+      <w:tr>
+        <w:tc>
+          <w:tcPr>
+            <w:tcW w:type="dxa" w:w="0"/>
+            <w:tcBorders>
+              <w:top w:val="single" w:color="D9D3C8" w:sz="2"/>
+              <w:left w:val="none"/>
+              <w:bottom w:val="single" w:color="D9D3C8" w:sz="2"/>
+              <w:right w:val="none"/>
+            </w:tcBorders>
+            <w:tcMar>
+              <w:top w:type="dxa" w:w="70"/>
+              <w:left w:type="dxa" w:w="110"/>
+              <w:bottom w:type="dxa" w:w="70"/>
+              <w:right w:type="dxa" w:w="110"/>
+            </w:tcMar>
+          </w:tcPr>
+          <w:p>
+            <w:pPr>
+              <w:spacing w:after="0"/>
+              <w:jc w:val="left"/>
+            </w:pPr>
+            <w:r>
+              <w:rPr>
+                <w:rFonts w:ascii="Calibri" w:cs="Calibri" w:eastAsia="Calibri" w:hAnsi="Calibri"/>
+                <w:b w:val="false"/>
+                <w:bCs w:val="false"/>
+                <w:color w:val="1F1D1A"/>
+                <w:sz w:val="19"/>
+                <w:szCs w:val="19"/>
+              </w:rPr>
+              <w:t xml:space="preserve">Man-Wah Cheers</w:t>
+            </w:r>
+          </w:p>
+        </w:tc>
+        <w:tc>
+          <w:tcPr>
+            <w:tcW w:type="dxa" w:w="0"/>
+            <w:tcBorders>
+              <w:top w:val="single" w:color="D9D3C8" w:sz="2"/>
+              <w:left w:val="none"/>
+              <w:bottom w:val="single" w:color="D9D3C8" w:sz="2"/>
+              <w:right w:val="none"/>
+            </w:tcBorders>
+            <w:tcMar>
+              <w:top w:type="dxa" w:w="70"/>
+              <w:left w:type="dxa" w:w="110"/>
+              <w:bottom w:type="dxa" w:w="70"/>
+              <w:right w:type="dxa" w:w="110"/>
+            </w:tcMar>
+          </w:tcPr>
+          <w:p>
+            <w:pPr>
+              <w:spacing w:after="0"/>
+              <w:jc w:val="right"/>
+            </w:pPr>
+            <w:r>
+              <w:rPr>
+                <w:rFonts w:ascii="Calibri" w:cs="Calibri" w:eastAsia="Calibri" w:hAnsi="Calibri"/>
+                <w:b w:val="false"/>
+                <w:bCs w:val="false"/>
+                <w:color w:val="1F1D1A"/>
+                <w:sz w:val="19"/>
+                <w:szCs w:val="19"/>
+              </w:rPr>
+              <w:t xml:space="preserve">9</w:t>
+            </w:r>
+          </w:p>
+        </w:tc>
+        <w:tc>
+          <w:tcPr>
+            <w:tcW w:type="dxa" w:w="0"/>
+            <w:tcBorders>
+              <w:top w:val="single" w:color="D9D3C8" w:sz="2"/>
+              <w:left w:val="none"/>
+              <w:bottom w:val="single" w:color="D9D3C8" w:sz="2"/>
+              <w:right w:val="none"/>
+            </w:tcBorders>
+            <w:tcMar>
+              <w:top w:type="dxa" w:w="70"/>
+              <w:left w:type="dxa" w:w="110"/>
+              <w:bottom w:type="dxa" w:w="70"/>
+              <w:right w:type="dxa" w:w="110"/>
+            </w:tcMar>
+          </w:tcPr>
+          <w:p>
+            <w:pPr>
+              <w:spacing w:after="0"/>
+              <w:jc w:val="right"/>
+            </w:pPr>
+            <w:r>
+              <w:rPr>
+                <w:rFonts w:ascii="Calibri" w:cs="Calibri" w:eastAsia="Calibri" w:hAnsi="Calibri"/>
+                <w:b w:val="false"/>
+                <w:bCs w:val="false"/>
+                <w:color w:val="1F1D1A"/>
+                <w:sz w:val="19"/>
+                <w:szCs w:val="19"/>
+              </w:rPr>
+              <w:t xml:space="preserve">6%</w:t>
+            </w:r>
+          </w:p>
+        </w:tc>
+        <w:tc>
+          <w:tcPr>
+            <w:tcW w:type="dxa" w:w="0"/>
+            <w:tcBorders>
+              <w:top w:val="single" w:color="D9D3C8" w:sz="2"/>
+              <w:left w:val="none"/>
+              <w:bottom w:val="single" w:color="D9D3C8" w:sz="2"/>
+              <w:right w:val="none"/>
+            </w:tcBorders>
+            <w:tcMar>
+              <w:top w:type="dxa" w:w="70"/>
+              <w:left w:type="dxa" w:w="110"/>
+              <w:bottom w:type="dxa" w:w="70"/>
+              <w:right w:type="dxa" w:w="110"/>
+            </w:tcMar>
+          </w:tcPr>
+          <w:p>
+            <w:pPr>
+              <w:spacing w:after="0"/>
+              <w:jc w:val="right"/>
+            </w:pPr>
+            <w:r>
+              <w:rPr>
+                <w:rFonts w:ascii="Calibri" w:cs="Calibri" w:eastAsia="Calibri" w:hAnsi="Calibri"/>
+                <w:b w:val="false"/>
+                <w:bCs w:val="false"/>
+                <w:color w:val="1F1D1A"/>
+                <w:sz w:val="19"/>
+                <w:szCs w:val="19"/>
+              </w:rPr>
+              <w:t xml:space="preserve">$2,700</w:t>
+            </w:r>
+          </w:p>
+        </w:tc>
+        <w:tc>
+          <w:tcPr>
+            <w:tcW w:type="dxa" w:w="0"/>
+            <w:tcBorders>
+              <w:top w:val="single" w:color="D9D3C8" w:sz="2"/>
+              <w:left w:val="none"/>
+              <w:bottom w:val="single" w:color="D9D3C8" w:sz="2"/>
+              <w:right w:val="none"/>
+            </w:tcBorders>
+            <w:tcMar>
+              <w:top w:type="dxa" w:w="70"/>
+              <w:left w:type="dxa" w:w="110"/>
+              <w:bottom w:type="dxa" w:w="70"/>
+              <w:right w:type="dxa" w:w="110"/>
+            </w:tcMar>
+          </w:tcPr>
+          <w:p>
+            <w:pPr>
+              <w:spacing w:after="0"/>
+              <w:jc w:val="right"/>
+            </w:pPr>
+            <w:r>
+              <w:rPr>
+                <w:rFonts w:ascii="Calibri" w:cs="Calibri" w:eastAsia="Calibri" w:hAnsi="Calibri"/>
+                <w:b w:val="false"/>
+                <w:bCs w:val="false"/>
+                <w:color w:val="1F1D1A"/>
+                <w:sz w:val="19"/>
+                <w:szCs w:val="19"/>
+              </w:rPr>
+              <w:t xml:space="preserve">$1,800</w:t>
+            </w:r>
+          </w:p>
+        </w:tc>
+        <w:tc>
+          <w:tcPr>
+            <w:tcW w:type="dxa" w:w="0"/>
+            <w:tcBorders>
+              <w:top w:val="single" w:color="D9D3C8" w:sz="2"/>
+              <w:left w:val="none"/>
+              <w:bottom w:val="single" w:color="D9D3C8" w:sz="2"/>
+              <w:right w:val="none"/>
+            </w:tcBorders>
+            <w:tcMar>
+              <w:top w:type="dxa" w:w="70"/>
+              <w:left w:type="dxa" w:w="110"/>
+              <w:bottom w:type="dxa" w:w="70"/>
+              <w:right w:type="dxa" w:w="110"/>
+            </w:tcMar>
+          </w:tcPr>
+          <w:p>
+            <w:pPr>
+              <w:spacing w:after="0"/>
+              <w:jc w:val="right"/>
+            </w:pPr>
+            <w:r>
+              <w:rPr>
+                <w:rFonts w:ascii="Calibri" w:cs="Calibri" w:eastAsia="Calibri" w:hAnsi="Calibri"/>
+                <w:b w:val="false"/>
+                <w:bCs w:val="false"/>
+                <w:color w:val="1F1D1A"/>
+                <w:sz w:val="19"/>
+                <w:szCs w:val="19"/>
+              </w:rPr>
+              <w:t xml:space="preserve">33%</w:t>
+            </w:r>
+          </w:p>
+        </w:tc>
+      </w:tr>
+      <w:tr>
+        <w:tc>
+          <w:tcPr>
+            <w:tcW w:type="dxa" w:w="0"/>
+            <w:tcBorders>
+              <w:top w:val="single" w:color="D9D3C8" w:sz="2"/>
+              <w:left w:val="none"/>
+              <w:bottom w:val="single" w:color="D9D3C8" w:sz="2"/>
+              <w:right w:val="none"/>
+            </w:tcBorders>
+            <w:tcMar>
+              <w:top w:type="dxa" w:w="70"/>
+              <w:left w:type="dxa" w:w="110"/>
+              <w:bottom w:type="dxa" w:w="70"/>
+              <w:right w:type="dxa" w:w="110"/>
+            </w:tcMar>
+          </w:tcPr>
+          <w:p>
+            <w:pPr>
+              <w:spacing w:after="0"/>
+              <w:jc w:val="left"/>
+            </w:pPr>
+            <w:r>
+              <w:rPr>
+                <w:rFonts w:ascii="Calibri" w:cs="Calibri" w:eastAsia="Calibri" w:hAnsi="Calibri"/>
+                <w:b w:val="false"/>
+                <w:bCs w:val="false"/>
+                <w:color w:val="1F1D1A"/>
+                <w:sz w:val="19"/>
+                <w:szCs w:val="19"/>
+              </w:rPr>
+              <w:t xml:space="preserve">Franklin</w:t>
+            </w:r>
+          </w:p>
+        </w:tc>
+        <w:tc>
+          <w:tcPr>
+            <w:tcW w:type="dxa" w:w="0"/>
+            <w:tcBorders>
+              <w:top w:val="single" w:color="D9D3C8" w:sz="2"/>
+              <w:left w:val="none"/>
+              <w:bottom w:val="single" w:color="D9D3C8" w:sz="2"/>
+              <w:right w:val="none"/>
+            </w:tcBorders>
+            <w:tcMar>
+              <w:top w:type="dxa" w:w="70"/>
+              <w:left w:type="dxa" w:w="110"/>
+              <w:bottom w:type="dxa" w:w="70"/>
+              <w:right w:type="dxa" w:w="110"/>
+            </w:tcMar>
+          </w:tcPr>
+          <w:p>
+            <w:pPr>
+              <w:spacing w:after="0"/>
+              <w:jc w:val="right"/>
+            </w:pPr>
+            <w:r>
+              <w:rPr>
+                <w:rFonts w:ascii="Calibri" w:cs="Calibri" w:eastAsia="Calibri" w:hAnsi="Calibri"/>
+                <w:b w:val="false"/>
+                <w:bCs w:val="false"/>
+                <w:color w:val="1F1D1A"/>
+                <w:sz w:val="19"/>
+                <w:szCs w:val="19"/>
+              </w:rPr>
+              <w:t xml:space="preserve">6</w:t>
+            </w:r>
+          </w:p>
+        </w:tc>
+        <w:tc>
+          <w:tcPr>
+            <w:tcW w:type="dxa" w:w="0"/>
+            <w:tcBorders>
+              <w:top w:val="single" w:color="D9D3C8" w:sz="2"/>
+              <w:left w:val="none"/>
+              <w:bottom w:val="single" w:color="D9D3C8" w:sz="2"/>
+              <w:right w:val="none"/>
+            </w:tcBorders>
+            <w:tcMar>
+              <w:top w:type="dxa" w:w="70"/>
+              <w:left w:type="dxa" w:w="110"/>
+              <w:bottom w:type="dxa" w:w="70"/>
+              <w:right w:type="dxa" w:w="110"/>
+            </w:tcMar>
+          </w:tcPr>
+          <w:p>
+            <w:pPr>
+              <w:spacing w:after="0"/>
+              <w:jc w:val="right"/>
+            </w:pPr>
+            <w:r>
+              <w:rPr>
+                <w:rFonts w:ascii="Calibri" w:cs="Calibri" w:eastAsia="Calibri" w:hAnsi="Calibri"/>
+                <w:b w:val="false"/>
+                <w:bCs w:val="false"/>
+                <w:color w:val="1F1D1A"/>
+                <w:sz w:val="19"/>
+                <w:szCs w:val="19"/>
+              </w:rPr>
+              <w:t xml:space="preserve">4%</w:t>
+            </w:r>
+          </w:p>
+        </w:tc>
+        <w:tc>
+          <w:tcPr>
+            <w:tcW w:type="dxa" w:w="0"/>
+            <w:tcBorders>
+              <w:top w:val="single" w:color="D9D3C8" w:sz="2"/>
+              <w:left w:val="none"/>
+              <w:bottom w:val="single" w:color="D9D3C8" w:sz="2"/>
+              <w:right w:val="none"/>
+            </w:tcBorders>
+            <w:tcMar>
+              <w:top w:type="dxa" w:w="70"/>
+              <w:left w:type="dxa" w:w="110"/>
+              <w:bottom w:type="dxa" w:w="70"/>
+              <w:right w:type="dxa" w:w="110"/>
+            </w:tcMar>
+          </w:tcPr>
+          <w:p>
+            <w:pPr>
+              <w:spacing w:after="0"/>
+              <w:jc w:val="right"/>
+            </w:pPr>
+            <w:r>
+              <w:rPr>
+                <w:rFonts w:ascii="Calibri" w:cs="Calibri" w:eastAsia="Calibri" w:hAnsi="Calibri"/>
+                <w:b w:val="false"/>
+                <w:bCs w:val="false"/>
+                <w:color w:val="1F1D1A"/>
+                <w:sz w:val="19"/>
+                <w:szCs w:val="19"/>
+              </w:rPr>
+              <w:t xml:space="preserve">$2,100</w:t>
+            </w:r>
+          </w:p>
+        </w:tc>
+        <w:tc>
+          <w:tcPr>
+            <w:tcW w:type="dxa" w:w="0"/>
+            <w:tcBorders>
+              <w:top w:val="single" w:color="D9D3C8" w:sz="2"/>
+              <w:left w:val="none"/>
+              <w:bottom w:val="single" w:color="D9D3C8" w:sz="2"/>
+              <w:right w:val="none"/>
+            </w:tcBorders>
+            <w:tcMar>
+              <w:top w:type="dxa" w:w="70"/>
+              <w:left w:type="dxa" w:w="110"/>
+              <w:bottom w:type="dxa" w:w="70"/>
+              <w:right w:type="dxa" w:w="110"/>
+            </w:tcMar>
+          </w:tcPr>
+          <w:p>
+            <w:pPr>
+              <w:spacing w:after="0"/>
+              <w:jc w:val="right"/>
+            </w:pPr>
+            <w:r>
+              <w:rPr>
+                <w:rFonts w:ascii="Calibri" w:cs="Calibri" w:eastAsia="Calibri" w:hAnsi="Calibri"/>
+                <w:b w:val="false"/>
+                <w:bCs w:val="false"/>
+                <w:color w:val="1F1D1A"/>
+                <w:sz w:val="19"/>
+                <w:szCs w:val="19"/>
+              </w:rPr>
+              <w:t xml:space="preserve">$1,400</w:t>
+            </w:r>
+          </w:p>
+        </w:tc>
+        <w:tc>
+          <w:tcPr>
+            <w:tcW w:type="dxa" w:w="0"/>
+            <w:tcBorders>
+              <w:top w:val="single" w:color="D9D3C8" w:sz="2"/>
+              <w:left w:val="none"/>
+              <w:bottom w:val="single" w:color="D9D3C8" w:sz="2"/>
+              <w:right w:val="none"/>
+            </w:tcBorders>
+            <w:tcMar>
+              <w:top w:type="dxa" w:w="70"/>
+              <w:left w:type="dxa" w:w="110"/>
+              <w:bottom w:type="dxa" w:w="70"/>
+              <w:right w:type="dxa" w:w="110"/>
+            </w:tcMar>
+          </w:tcPr>
+          <w:p>
+            <w:pPr>
+              <w:spacing w:after="0"/>
+              <w:jc w:val="right"/>
+            </w:pPr>
+            <w:r>
+              <w:rPr>
+                <w:rFonts w:ascii="Calibri" w:cs="Calibri" w:eastAsia="Calibri" w:hAnsi="Calibri"/>
+                <w:b w:val="false"/>
+                <w:bCs w:val="false"/>
+                <w:color w:val="1F1D1A"/>
+                <w:sz w:val="19"/>
+                <w:szCs w:val="19"/>
+              </w:rPr>
+              <w:t xml:space="preserve">33%</w:t>
+            </w:r>
+          </w:p>
+        </w:tc>
+      </w:tr>
+    </w:tbl>
+    <w:p>
+      <w:pPr>
+        <w:spacing w:after="120" w:before="0"/>
+      </w:pPr>
+      <w:r>
+        <w:rPr>
+          <w:rFonts w:ascii="Calibri" w:cs="Calibri" w:eastAsia="Calibri" w:hAnsi="Calibri"/>
+          <w:color w:val="1F1D1A"/>
+          <w:sz w:val="21"/>
+          <w:szCs w:val="21"/>
+        </w:rPr>
+        <w:t xml:space="preserve"/>
+      </w:r>
+    </w:p>
+    <w:p>
+      <w:pPr>
+        <w:spacing w:after="120" w:before="0"/>
+      </w:pPr>
+      <w:r>
+        <w:rPr>
+          <w:rFonts w:ascii="Calibri" w:cs="Calibri" w:eastAsia="Calibri" w:hAnsi="Calibri"/>
+          <w:color w:val="1F1D1A"/>
+          <w:sz w:val="21"/>
+          <w:szCs w:val="21"/>
+        </w:rPr>
+        <w:t xml:space="preserve">You are the largest brand on both walls. The second-largest recliner brand is Franklin, at 24% — and Franklin is a recliner specialist, holding only 4% of the motion sofa wall. </w:t>
+      </w:r>
+      <w:r>
+        <w:rPr>
+          <w:rFonts w:ascii="Calibri" w:cs="Calibri" w:eastAsia="Calibri" w:hAnsi="Calibri"/>
+          <w:b/>
+          <w:bCs/>
+          <w:color w:val="1F1D1A"/>
+          <w:sz w:val="21"/>
+          <w:szCs w:val="21"/>
+        </w:rPr>
+        <w:t xml:space="preserve">Whatever Franklin is doing, it is aimed at one category.</w:t>
+      </w:r>
+    </w:p>
+    <w:p>
+      <w:pPr>
+        <w:pageBreakBefore/>
+      </w:pPr>
+    </w:p>
+    <w:p>
+      <w:pPr>
+        <w:pStyle w:val="Heading1"/>
+        <w:spacing w:after="140" w:before="320"/>
+      </w:pPr>
+      <w:r>
+        <w:rPr>
+          <w:rFonts w:ascii="Calibri" w:cs="Calibri" w:eastAsia="Calibri" w:hAnsi="Calibri"/>
+          <w:b/>
+          <w:bCs/>
+          <w:color w:val="1F1D1A"/>
+          <w:sz w:val="26"/>
+          <w:szCs w:val="26"/>
+        </w:rPr>
+        <w:t xml:space="preserve">3.  Franklin has built a shadow of your recliner line</w:t>
+      </w:r>
+    </w:p>
+    <w:p>
+      <w:pPr>
+        <w:spacing w:after="150" w:before="0"/>
+      </w:pPr>
+      <w:r>
+        <w:rPr>
+          <w:rFonts w:ascii="Calibri" w:cs="Calibri" w:eastAsia="Calibri" w:hAnsi="Calibri"/>
+          <w:b/>
+          <w:bCs/>
+          <w:color w:val="1F1D1A"/>
+          <w:sz w:val="21"/>
+          <w:szCs w:val="21"/>
+        </w:rPr>
+        <w:t xml:space="preserve">All 36 of Franklin's recliner models sit within 10% of one of your 48. </w:t>
+      </w:r>
+      <w:r>
+        <w:rPr>
+          <w:rFonts w:ascii="Calibri" w:cs="Calibri" w:eastAsia="Calibri" w:hAnsi="Calibri"/>
+          <w:color w:val="1F1D1A"/>
+          <w:sz w:val="21"/>
+          <w:szCs w:val="21"/>
+        </w:rPr>
+        <w:t xml:space="preserve">Not most of them — all of them. And Franklin reaches those prices from above: through every volume band it lists higher than you and marks down harder, so the two brands arrive at the same shelf price from opposite directions.</w:t>
+      </w:r>
+    </w:p>
+    <w:tbl>
+      <w:tblPr>
+        <w:tblW w:type="dxa" w:w="9360"/>
+        <w:tblBorders>
+          <w:top w:val="single" w:color="auto" w:sz="4"/>
+          <w:left w:val="single" w:color="auto" w:sz="4"/>
+          <w:bottom w:val="single" w:color="auto" w:sz="4"/>
+          <w:right w:val="single" w:color="auto" w:sz="4"/>
+          <w:insideH w:val="single" w:color="auto" w:sz="4"/>
+          <w:insideV w:val="single" w:color="auto" w:sz="4"/>
+        </w:tblBorders>
+      </w:tblPr>
+      <w:tblGrid>
+        <w:gridCol w:w="2360"/>
+        <w:gridCol w:w="1700"/>
+        <w:gridCol w:w="1700"/>
+        <w:gridCol w:w="1800"/>
+        <w:gridCol w:w="1800"/>
+      </w:tblGrid>
+      <w:tr>
+        <w:trPr>
+          <w:tblHeader/>
+        </w:trPr>
+        <w:tc>
+          <w:tcPr>
+            <w:tcW w:type="dxa" w:w="0"/>
+            <w:tcBorders>
+              <w:top w:val="single" w:color="D9D3C8" w:sz="2"/>
+              <w:left w:val="none"/>
+              <w:bottom w:val="single" w:color="D9D3C8" w:sz="2"/>
+              <w:right w:val="none"/>
+            </w:tcBorders>
+            <w:shd w:fill="F0EBE0" w:color="auto" w:val="clear"/>
+            <w:tcMar>
+              <w:top w:type="dxa" w:w="70"/>
+              <w:left w:type="dxa" w:w="110"/>
+              <w:bottom w:type="dxa" w:w="70"/>
+              <w:right w:type="dxa" w:w="110"/>
+            </w:tcMar>
+          </w:tcPr>
+          <w:p>
+            <w:pPr>
+              <w:spacing w:after="0"/>
+              <w:jc w:val="left"/>
+            </w:pPr>
+            <w:r>
+              <w:rPr>
+                <w:rFonts w:ascii="Calibri" w:cs="Calibri" w:eastAsia="Calibri" w:hAnsi="Calibri"/>
+                <w:b/>
+                <w:bCs/>
+                <w:color w:val="1F1D1A"/>
+                <w:sz w:val="19"/>
+                <w:szCs w:val="19"/>
+              </w:rPr>
+              <w:t xml:space="preserve">Selling-price band</w:t>
+            </w:r>
+          </w:p>
+        </w:tc>
+        <w:tc>
+          <w:tcPr>
+            <w:tcW w:type="dxa" w:w="0"/>
+            <w:tcBorders>
+              <w:top w:val="single" w:color="D9D3C8" w:sz="2"/>
+              <w:left w:val="none"/>
+              <w:bottom w:val="single" w:color="D9D3C8" w:sz="2"/>
+              <w:right w:val="none"/>
+            </w:tcBorders>
+            <w:shd w:fill="F0EBE0" w:color="auto" w:val="clear"/>
+            <w:tcMar>
+              <w:top w:type="dxa" w:w="70"/>
+              <w:left w:type="dxa" w:w="110"/>
+              <w:bottom w:type="dxa" w:w="70"/>
+              <w:right w:type="dxa" w:w="110"/>
+            </w:tcMar>
+          </w:tcPr>
+          <w:p>
+            <w:pPr>
+              <w:spacing w:after="0"/>
+              <w:jc w:val="right"/>
+            </w:pPr>
+            <w:r>
+              <w:rPr>
+                <w:rFonts w:ascii="Calibri" w:cs="Calibri" w:eastAsia="Calibri" w:hAnsi="Calibri"/>
+                <w:b/>
+                <w:bCs/>
+                <w:color w:val="1F1D1A"/>
+                <w:sz w:val="19"/>
+                <w:szCs w:val="19"/>
+              </w:rPr>
+              <w:t xml:space="preserve">Your list</w:t>
+            </w:r>
+          </w:p>
+        </w:tc>
+        <w:tc>
+          <w:tcPr>
+            <w:tcW w:type="dxa" w:w="0"/>
+            <w:tcBorders>
+              <w:top w:val="single" w:color="D9D3C8" w:sz="2"/>
+              <w:left w:val="none"/>
+              <w:bottom w:val="single" w:color="D9D3C8" w:sz="2"/>
+              <w:right w:val="none"/>
+            </w:tcBorders>
+            <w:shd w:fill="F0EBE0" w:color="auto" w:val="clear"/>
+            <w:tcMar>
+              <w:top w:type="dxa" w:w="70"/>
+              <w:left w:type="dxa" w:w="110"/>
+              <w:bottom w:type="dxa" w:w="70"/>
+              <w:right w:type="dxa" w:w="110"/>
+            </w:tcMar>
+          </w:tcPr>
+          <w:p>
+            <w:pPr>
+              <w:spacing w:after="0"/>
+              <w:jc w:val="right"/>
+            </w:pPr>
+            <w:r>
+              <w:rPr>
+                <w:rFonts w:ascii="Calibri" w:cs="Calibri" w:eastAsia="Calibri" w:hAnsi="Calibri"/>
+                <w:b/>
+                <w:bCs/>
+                <w:color w:val="1F1D1A"/>
+                <w:sz w:val="19"/>
+                <w:szCs w:val="19"/>
+              </w:rPr>
+              <w:t xml:space="preserve">Your disc</w:t>
+            </w:r>
+          </w:p>
+        </w:tc>
+        <w:tc>
+          <w:tcPr>
+            <w:tcW w:type="dxa" w:w="0"/>
+            <w:tcBorders>
+              <w:top w:val="single" w:color="D9D3C8" w:sz="2"/>
+              <w:left w:val="none"/>
+              <w:bottom w:val="single" w:color="D9D3C8" w:sz="2"/>
+              <w:right w:val="none"/>
+            </w:tcBorders>
+            <w:shd w:fill="F0EBE0" w:color="auto" w:val="clear"/>
+            <w:tcMar>
+              <w:top w:type="dxa" w:w="70"/>
+              <w:left w:type="dxa" w:w="110"/>
+              <w:bottom w:type="dxa" w:w="70"/>
+              <w:right w:type="dxa" w:w="110"/>
+            </w:tcMar>
+          </w:tcPr>
+          <w:p>
+            <w:pPr>
+              <w:spacing w:after="0"/>
+              <w:jc w:val="right"/>
+            </w:pPr>
+            <w:r>
+              <w:rPr>
+                <w:rFonts w:ascii="Calibri" w:cs="Calibri" w:eastAsia="Calibri" w:hAnsi="Calibri"/>
+                <w:b/>
+                <w:bCs/>
+                <w:color w:val="1F1D1A"/>
+                <w:sz w:val="19"/>
+                <w:szCs w:val="19"/>
+              </w:rPr>
+              <w:t xml:space="preserve">Franklin list</w:t>
+            </w:r>
+          </w:p>
+        </w:tc>
+        <w:tc>
+          <w:tcPr>
+            <w:tcW w:type="dxa" w:w="0"/>
+            <w:tcBorders>
+              <w:top w:val="single" w:color="D9D3C8" w:sz="2"/>
+              <w:left w:val="none"/>
+              <w:bottom w:val="single" w:color="D9D3C8" w:sz="2"/>
+              <w:right w:val="none"/>
+            </w:tcBorders>
+            <w:shd w:fill="F0EBE0" w:color="auto" w:val="clear"/>
+            <w:tcMar>
+              <w:top w:type="dxa" w:w="70"/>
+              <w:left w:type="dxa" w:w="110"/>
+              <w:bottom w:type="dxa" w:w="70"/>
+              <w:right w:type="dxa" w:w="110"/>
+            </w:tcMar>
+          </w:tcPr>
+          <w:p>
+            <w:pPr>
+              <w:spacing w:after="0"/>
+              <w:jc w:val="right"/>
+            </w:pPr>
+            <w:r>
+              <w:rPr>
+                <w:rFonts w:ascii="Calibri" w:cs="Calibri" w:eastAsia="Calibri" w:hAnsi="Calibri"/>
+                <w:b/>
+                <w:bCs/>
+                <w:color w:val="1F1D1A"/>
+                <w:sz w:val="19"/>
+                <w:szCs w:val="19"/>
+              </w:rPr>
+              <w:t xml:space="preserve">Franklin disc</w:t>
+            </w:r>
+          </w:p>
+        </w:tc>
+      </w:tr>
+      <w:tr>
+        <w:tc>
+          <w:tcPr>
+            <w:tcW w:type="dxa" w:w="0"/>
+            <w:tcBorders>
+              <w:top w:val="single" w:color="D9D3C8" w:sz="2"/>
+              <w:left w:val="none"/>
+              <w:bottom w:val="single" w:color="D9D3C8" w:sz="2"/>
+              <w:right w:val="none"/>
+            </w:tcBorders>
+            <w:tcMar>
+              <w:top w:type="dxa" w:w="70"/>
+              <w:left w:type="dxa" w:w="110"/>
+              <w:bottom w:type="dxa" w:w="70"/>
+              <w:right w:type="dxa" w:w="110"/>
+            </w:tcMar>
+          </w:tcPr>
+          <w:p>
+            <w:pPr>
+              <w:spacing w:after="0"/>
+              <w:jc w:val="left"/>
+            </w:pPr>
+            <w:r>
+              <w:rPr>
+                <w:rFonts w:ascii="Calibri" w:cs="Calibri" w:eastAsia="Calibri" w:hAnsi="Calibri"/>
+                <w:b w:val="false"/>
+                <w:bCs w:val="false"/>
+                <w:color w:val="1F1D1A"/>
+                <w:sz w:val="19"/>
+                <w:szCs w:val="19"/>
+              </w:rPr>
+              <w:t xml:space="preserve">$0 – 600</w:t>
+            </w:r>
+          </w:p>
+        </w:tc>
+        <w:tc>
+          <w:tcPr>
+            <w:tcW w:type="dxa" w:w="0"/>
+            <w:tcBorders>
+              <w:top w:val="single" w:color="D9D3C8" w:sz="2"/>
+              <w:left w:val="none"/>
+              <w:bottom w:val="single" w:color="D9D3C8" w:sz="2"/>
+              <w:right w:val="none"/>
+            </w:tcBorders>
+            <w:tcMar>
+              <w:top w:type="dxa" w:w="70"/>
+              <w:left w:type="dxa" w:w="110"/>
+              <w:bottom w:type="dxa" w:w="70"/>
+              <w:right w:type="dxa" w:w="110"/>
+            </w:tcMar>
+          </w:tcPr>
+          <w:p>
+            <w:pPr>
+              <w:spacing w:after="0"/>
+              <w:jc w:val="right"/>
+            </w:pPr>
+            <w:r>
+              <w:rPr>
+                <w:rFonts w:ascii="Calibri" w:cs="Calibri" w:eastAsia="Calibri" w:hAnsi="Calibri"/>
+                <w:b w:val="false"/>
+                <w:bCs w:val="false"/>
+                <w:color w:val="1F1D1A"/>
+                <w:sz w:val="19"/>
+                <w:szCs w:val="19"/>
+              </w:rPr>
+              <w:t xml:space="preserve">$1,164</w:t>
+            </w:r>
+          </w:p>
+        </w:tc>
+        <w:tc>
+          <w:tcPr>
+            <w:tcW w:type="dxa" w:w="0"/>
+            <w:tcBorders>
+              <w:top w:val="single" w:color="D9D3C8" w:sz="2"/>
+              <w:left w:val="none"/>
+              <w:bottom w:val="single" w:color="D9D3C8" w:sz="2"/>
+              <w:right w:val="none"/>
+            </w:tcBorders>
+            <w:tcMar>
+              <w:top w:type="dxa" w:w="70"/>
+              <w:left w:type="dxa" w:w="110"/>
+              <w:bottom w:type="dxa" w:w="70"/>
+              <w:right w:type="dxa" w:w="110"/>
+            </w:tcMar>
+          </w:tcPr>
+          <w:p>
+            <w:pPr>
+              <w:spacing w:after="0"/>
+              <w:jc w:val="right"/>
+            </w:pPr>
+            <w:r>
+              <w:rPr>
+                <w:rFonts w:ascii="Calibri" w:cs="Calibri" w:eastAsia="Calibri" w:hAnsi="Calibri"/>
+                <w:b w:val="false"/>
+                <w:bCs w:val="false"/>
+                <w:color w:val="1F1D1A"/>
+                <w:sz w:val="19"/>
+                <w:szCs w:val="19"/>
+              </w:rPr>
+              <w:t xml:space="preserve">53%</w:t>
+            </w:r>
+          </w:p>
+        </w:tc>
+        <w:tc>
+          <w:tcPr>
+            <w:tcW w:type="dxa" w:w="0"/>
+            <w:tcBorders>
+              <w:top w:val="single" w:color="D9D3C8" w:sz="2"/>
+              <w:left w:val="none"/>
+              <w:bottom w:val="single" w:color="D9D3C8" w:sz="2"/>
+              <w:right w:val="none"/>
+            </w:tcBorders>
+            <w:tcMar>
+              <w:top w:type="dxa" w:w="70"/>
+              <w:left w:type="dxa" w:w="110"/>
+              <w:bottom w:type="dxa" w:w="70"/>
+              <w:right w:type="dxa" w:w="110"/>
+            </w:tcMar>
+          </w:tcPr>
+          <w:p>
+            <w:pPr>
+              <w:spacing w:after="0"/>
+              <w:jc w:val="right"/>
+            </w:pPr>
+            <w:r>
+              <w:rPr>
+                <w:rFonts w:ascii="Calibri" w:cs="Calibri" w:eastAsia="Calibri" w:hAnsi="Calibri"/>
+                <w:b w:val="false"/>
+                <w:bCs w:val="false"/>
+                <w:color w:val="1F1D1A"/>
+                <w:sz w:val="19"/>
+                <w:szCs w:val="19"/>
+              </w:rPr>
+              <w:t xml:space="preserve">$1,000</w:t>
+            </w:r>
+          </w:p>
+        </w:tc>
+        <w:tc>
+          <w:tcPr>
+            <w:tcW w:type="dxa" w:w="0"/>
+            <w:tcBorders>
+              <w:top w:val="single" w:color="D9D3C8" w:sz="2"/>
+              <w:left w:val="none"/>
+              <w:bottom w:val="single" w:color="D9D3C8" w:sz="2"/>
+              <w:right w:val="none"/>
+            </w:tcBorders>
+            <w:tcMar>
+              <w:top w:type="dxa" w:w="70"/>
+              <w:left w:type="dxa" w:w="110"/>
+              <w:bottom w:type="dxa" w:w="70"/>
+              <w:right w:type="dxa" w:w="110"/>
+            </w:tcMar>
+          </w:tcPr>
+          <w:p>
+            <w:pPr>
+              <w:spacing w:after="0"/>
+              <w:jc w:val="right"/>
+            </w:pPr>
+            <w:r>
+              <w:rPr>
+                <w:rFonts w:ascii="Calibri" w:cs="Calibri" w:eastAsia="Calibri" w:hAnsi="Calibri"/>
+                <w:b w:val="false"/>
+                <w:bCs w:val="false"/>
+                <w:color w:val="1F1D1A"/>
+                <w:sz w:val="19"/>
+                <w:szCs w:val="19"/>
+              </w:rPr>
+              <w:t xml:space="preserve">43%</w:t>
+            </w:r>
+          </w:p>
+        </w:tc>
+      </w:tr>
+      <w:tr>
+        <w:tc>
+          <w:tcPr>
+            <w:tcW w:type="dxa" w:w="0"/>
+            <w:tcBorders>
+              <w:top w:val="single" w:color="D9D3C8" w:sz="2"/>
+              <w:left w:val="none"/>
+              <w:bottom w:val="single" w:color="D9D3C8" w:sz="2"/>
+              <w:right w:val="none"/>
+            </w:tcBorders>
+            <w:tcMar>
+              <w:top w:type="dxa" w:w="70"/>
+              <w:left w:type="dxa" w:w="110"/>
+              <w:bottom w:type="dxa" w:w="70"/>
+              <w:right w:type="dxa" w:w="110"/>
+            </w:tcMar>
+          </w:tcPr>
+          <w:p>
+            <w:pPr>
+              <w:spacing w:after="0"/>
+              <w:jc w:val="left"/>
+            </w:pPr>
+            <w:r>
+              <w:rPr>
+                <w:rFonts w:ascii="Calibri" w:cs="Calibri" w:eastAsia="Calibri" w:hAnsi="Calibri"/>
+                <w:b w:val="false"/>
+                <w:bCs w:val="false"/>
+                <w:color w:val="1F1D1A"/>
+                <w:sz w:val="19"/>
+                <w:szCs w:val="19"/>
+              </w:rPr>
+              <w:t xml:space="preserve">$600 – 800</w:t>
+            </w:r>
+          </w:p>
+        </w:tc>
+        <w:tc>
+          <w:tcPr>
+            <w:tcW w:type="dxa" w:w="0"/>
+            <w:tcBorders>
+              <w:top w:val="single" w:color="D9D3C8" w:sz="2"/>
+              <w:left w:val="none"/>
+              <w:bottom w:val="single" w:color="D9D3C8" w:sz="2"/>
+              <w:right w:val="none"/>
+            </w:tcBorders>
+            <w:tcMar>
+              <w:top w:type="dxa" w:w="70"/>
+              <w:left w:type="dxa" w:w="110"/>
+              <w:bottom w:type="dxa" w:w="70"/>
+              <w:right w:type="dxa" w:w="110"/>
+            </w:tcMar>
+          </w:tcPr>
+          <w:p>
+            <w:pPr>
+              <w:spacing w:after="0"/>
+              <w:jc w:val="right"/>
+            </w:pPr>
+            <w:r>
+              <w:rPr>
+                <w:rFonts w:ascii="Calibri" w:cs="Calibri" w:eastAsia="Calibri" w:hAnsi="Calibri"/>
+                <w:b w:val="false"/>
+                <w:bCs w:val="false"/>
+                <w:color w:val="1F1D1A"/>
+                <w:sz w:val="19"/>
+                <w:szCs w:val="19"/>
+              </w:rPr>
+              <w:t xml:space="preserve">$1,200</w:t>
+            </w:r>
+          </w:p>
+        </w:tc>
+        <w:tc>
+          <w:tcPr>
+            <w:tcW w:type="dxa" w:w="0"/>
+            <w:tcBorders>
+              <w:top w:val="single" w:color="D9D3C8" w:sz="2"/>
+              <w:left w:val="none"/>
+              <w:bottom w:val="single" w:color="D9D3C8" w:sz="2"/>
+              <w:right w:val="none"/>
+            </w:tcBorders>
+            <w:tcMar>
+              <w:top w:type="dxa" w:w="70"/>
+              <w:left w:type="dxa" w:w="110"/>
+              <w:bottom w:type="dxa" w:w="70"/>
+              <w:right w:type="dxa" w:w="110"/>
+            </w:tcMar>
+          </w:tcPr>
+          <w:p>
+            <w:pPr>
+              <w:spacing w:after="0"/>
+              <w:jc w:val="right"/>
+            </w:pPr>
+            <w:r>
+              <w:rPr>
+                <w:rFonts w:ascii="Calibri" w:cs="Calibri" w:eastAsia="Calibri" w:hAnsi="Calibri"/>
+                <w:b w:val="false"/>
+                <w:bCs w:val="false"/>
+                <w:color w:val="1F1D1A"/>
+                <w:sz w:val="19"/>
+                <w:szCs w:val="19"/>
+              </w:rPr>
+              <w:t xml:space="preserve">44%</w:t>
+            </w:r>
+          </w:p>
+        </w:tc>
+        <w:tc>
+          <w:tcPr>
+            <w:tcW w:type="dxa" w:w="0"/>
+            <w:tcBorders>
+              <w:top w:val="single" w:color="D9D3C8" w:sz="2"/>
+              <w:left w:val="none"/>
+              <w:bottom w:val="single" w:color="D9D3C8" w:sz="2"/>
+              <w:right w:val="none"/>
+            </w:tcBorders>
+            <w:tcMar>
+              <w:top w:type="dxa" w:w="70"/>
+              <w:left w:type="dxa" w:w="110"/>
+              <w:bottom w:type="dxa" w:w="70"/>
+              <w:right w:type="dxa" w:w="110"/>
+            </w:tcMar>
+          </w:tcPr>
+          <w:p>
+            <w:pPr>
+              <w:spacing w:after="0"/>
+              <w:jc w:val="right"/>
+            </w:pPr>
+            <w:r>
+              <w:rPr>
+                <w:rFonts w:ascii="Calibri" w:cs="Calibri" w:eastAsia="Calibri" w:hAnsi="Calibri"/>
+                <w:b w:val="false"/>
+                <w:bCs w:val="false"/>
+                <w:color w:val="1F1D1A"/>
+                <w:sz w:val="19"/>
+                <w:szCs w:val="19"/>
+              </w:rPr>
+              <w:t xml:space="preserve">$1,350</w:t>
+            </w:r>
+          </w:p>
+        </w:tc>
+        <w:tc>
+          <w:tcPr>
+            <w:tcW w:type="dxa" w:w="0"/>
+            <w:tcBorders>
+              <w:top w:val="single" w:color="D9D3C8" w:sz="2"/>
+              <w:left w:val="none"/>
+              <w:bottom w:val="single" w:color="D9D3C8" w:sz="2"/>
+              <w:right w:val="none"/>
+            </w:tcBorders>
+            <w:tcMar>
+              <w:top w:type="dxa" w:w="70"/>
+              <w:left w:type="dxa" w:w="110"/>
+              <w:bottom w:type="dxa" w:w="70"/>
+              <w:right w:type="dxa" w:w="110"/>
+            </w:tcMar>
+          </w:tcPr>
+          <w:p>
+            <w:pPr>
+              <w:spacing w:after="0"/>
+              <w:jc w:val="right"/>
+            </w:pPr>
+            <w:r>
+              <w:rPr>
+                <w:rFonts w:ascii="Calibri" w:cs="Calibri" w:eastAsia="Calibri" w:hAnsi="Calibri"/>
+                <w:b w:val="false"/>
+                <w:bCs w:val="false"/>
+                <w:color w:val="1F1D1A"/>
+                <w:sz w:val="19"/>
+                <w:szCs w:val="19"/>
+              </w:rPr>
+              <w:t xml:space="preserve">50%</w:t>
+            </w:r>
+          </w:p>
+        </w:tc>
+      </w:tr>
+      <w:tr>
+        <w:tc>
+          <w:tcPr>
+            <w:tcW w:type="dxa" w:w="0"/>
+            <w:tcBorders>
+              <w:top w:val="single" w:color="D9D3C8" w:sz="2"/>
+              <w:left w:val="none"/>
+              <w:bottom w:val="single" w:color="D9D3C8" w:sz="2"/>
+              <w:right w:val="none"/>
+            </w:tcBorders>
+            <w:tcMar>
+              <w:top w:type="dxa" w:w="70"/>
+              <w:left w:type="dxa" w:w="110"/>
+              <w:bottom w:type="dxa" w:w="70"/>
+              <w:right w:type="dxa" w:w="110"/>
+            </w:tcMar>
+          </w:tcPr>
+          <w:p>
+            <w:pPr>
+              <w:spacing w:after="0"/>
+              <w:jc w:val="left"/>
+            </w:pPr>
+            <w:r>
+              <w:rPr>
+                <w:rFonts w:ascii="Calibri" w:cs="Calibri" w:eastAsia="Calibri" w:hAnsi="Calibri"/>
+                <w:b w:val="false"/>
+                <w:bCs w:val="false"/>
+                <w:color w:val="1F1D1A"/>
+                <w:sz w:val="19"/>
+                <w:szCs w:val="19"/>
+              </w:rPr>
+              <w:t xml:space="preserve">$800 – 1,000</w:t>
+            </w:r>
+          </w:p>
+        </w:tc>
+        <w:tc>
+          <w:tcPr>
+            <w:tcW w:type="dxa" w:w="0"/>
+            <w:tcBorders>
+              <w:top w:val="single" w:color="D9D3C8" w:sz="2"/>
+              <w:left w:val="none"/>
+              <w:bottom w:val="single" w:color="D9D3C8" w:sz="2"/>
+              <w:right w:val="none"/>
+            </w:tcBorders>
+            <w:tcMar>
+              <w:top w:type="dxa" w:w="70"/>
+              <w:left w:type="dxa" w:w="110"/>
+              <w:bottom w:type="dxa" w:w="70"/>
+              <w:right w:type="dxa" w:w="110"/>
+            </w:tcMar>
+          </w:tcPr>
+          <w:p>
+            <w:pPr>
+              <w:spacing w:after="0"/>
+              <w:jc w:val="right"/>
+            </w:pPr>
+            <w:r>
+              <w:rPr>
+                <w:rFonts w:ascii="Calibri" w:cs="Calibri" w:eastAsia="Calibri" w:hAnsi="Calibri"/>
+                <w:b w:val="false"/>
+                <w:bCs w:val="false"/>
+                <w:color w:val="1F1D1A"/>
+                <w:sz w:val="19"/>
+                <w:szCs w:val="19"/>
+              </w:rPr>
+              <w:t xml:space="preserve">$1,399</w:t>
+            </w:r>
+          </w:p>
+        </w:tc>
+        <w:tc>
+          <w:tcPr>
+            <w:tcW w:type="dxa" w:w="0"/>
+            <w:tcBorders>
+              <w:top w:val="single" w:color="D9D3C8" w:sz="2"/>
+              <w:left w:val="none"/>
+              <w:bottom w:val="single" w:color="D9D3C8" w:sz="2"/>
+              <w:right w:val="none"/>
+            </w:tcBorders>
+            <w:tcMar>
+              <w:top w:type="dxa" w:w="70"/>
+              <w:left w:type="dxa" w:w="110"/>
+              <w:bottom w:type="dxa" w:w="70"/>
+              <w:right w:type="dxa" w:w="110"/>
+            </w:tcMar>
+          </w:tcPr>
+          <w:p>
+            <w:pPr>
+              <w:spacing w:after="0"/>
+              <w:jc w:val="right"/>
+            </w:pPr>
+            <w:r>
+              <w:rPr>
+                <w:rFonts w:ascii="Calibri" w:cs="Calibri" w:eastAsia="Calibri" w:hAnsi="Calibri"/>
+                <w:b w:val="false"/>
+                <w:bCs w:val="false"/>
+                <w:color w:val="1F1D1A"/>
+                <w:sz w:val="19"/>
+                <w:szCs w:val="19"/>
+              </w:rPr>
+              <w:t xml:space="preserve">37%</w:t>
+            </w:r>
+          </w:p>
+        </w:tc>
+        <w:tc>
+          <w:tcPr>
+            <w:tcW w:type="dxa" w:w="0"/>
+            <w:tcBorders>
+              <w:top w:val="single" w:color="D9D3C8" w:sz="2"/>
+              <w:left w:val="none"/>
+              <w:bottom w:val="single" w:color="D9D3C8" w:sz="2"/>
+              <w:right w:val="none"/>
+            </w:tcBorders>
+            <w:tcMar>
+              <w:top w:type="dxa" w:w="70"/>
+              <w:left w:type="dxa" w:w="110"/>
+              <w:bottom w:type="dxa" w:w="70"/>
+              <w:right w:type="dxa" w:w="110"/>
+            </w:tcMar>
+          </w:tcPr>
+          <w:p>
+            <w:pPr>
+              <w:spacing w:after="0"/>
+              <w:jc w:val="right"/>
+            </w:pPr>
+            <w:r>
+              <w:rPr>
+                <w:rFonts w:ascii="Calibri" w:cs="Calibri" w:eastAsia="Calibri" w:hAnsi="Calibri"/>
+                <w:b w:val="false"/>
+                <w:bCs w:val="false"/>
+                <w:color w:val="1F1D1A"/>
+                <w:sz w:val="19"/>
+                <w:szCs w:val="19"/>
+              </w:rPr>
+              <w:t xml:space="preserve">$1,775</w:t>
+            </w:r>
+          </w:p>
+        </w:tc>
+        <w:tc>
+          <w:tcPr>
+            <w:tcW w:type="dxa" w:w="0"/>
+            <w:tcBorders>
+              <w:top w:val="single" w:color="D9D3C8" w:sz="2"/>
+              <w:left w:val="none"/>
+              <w:bottom w:val="single" w:color="D9D3C8" w:sz="2"/>
+              <w:right w:val="none"/>
+            </w:tcBorders>
+            <w:tcMar>
+              <w:top w:type="dxa" w:w="70"/>
+              <w:left w:type="dxa" w:w="110"/>
+              <w:bottom w:type="dxa" w:w="70"/>
+              <w:right w:type="dxa" w:w="110"/>
+            </w:tcMar>
+          </w:tcPr>
+          <w:p>
+            <w:pPr>
+              <w:spacing w:after="0"/>
+              <w:jc w:val="right"/>
+            </w:pPr>
+            <w:r>
+              <w:rPr>
+                <w:rFonts w:ascii="Calibri" w:cs="Calibri" w:eastAsia="Calibri" w:hAnsi="Calibri"/>
+                <w:b w:val="false"/>
+                <w:bCs w:val="false"/>
+                <w:color w:val="1F1D1A"/>
+                <w:sz w:val="19"/>
+                <w:szCs w:val="19"/>
+              </w:rPr>
+              <w:t xml:space="preserve">47%</w:t>
+            </w:r>
+          </w:p>
+        </w:tc>
+      </w:tr>
+      <w:tr>
+        <w:tc>
+          <w:tcPr>
+            <w:tcW w:type="dxa" w:w="0"/>
+            <w:tcBorders>
+              <w:top w:val="single" w:color="D9D3C8" w:sz="2"/>
+              <w:left w:val="none"/>
+              <w:bottom w:val="single" w:color="D9D3C8" w:sz="2"/>
+              <w:right w:val="none"/>
+            </w:tcBorders>
+            <w:tcMar>
+              <w:top w:type="dxa" w:w="70"/>
+              <w:left w:type="dxa" w:w="110"/>
+              <w:bottom w:type="dxa" w:w="70"/>
+              <w:right w:type="dxa" w:w="110"/>
+            </w:tcMar>
+          </w:tcPr>
+          <w:p>
+            <w:pPr>
+              <w:spacing w:after="0"/>
+              <w:jc w:val="left"/>
+            </w:pPr>
+            <w:r>
+              <w:rPr>
+                <w:rFonts w:ascii="Calibri" w:cs="Calibri" w:eastAsia="Calibri" w:hAnsi="Calibri"/>
+                <w:b w:val="false"/>
+                <w:bCs w:val="false"/>
+                <w:color w:val="1F1D1A"/>
+                <w:sz w:val="19"/>
+                <w:szCs w:val="19"/>
+              </w:rPr>
+              <w:t xml:space="preserve">$1,000 – 1,300</w:t>
+            </w:r>
+          </w:p>
+        </w:tc>
+        <w:tc>
+          <w:tcPr>
+            <w:tcW w:type="dxa" w:w="0"/>
+            <w:tcBorders>
+              <w:top w:val="single" w:color="D9D3C8" w:sz="2"/>
+              <w:left w:val="none"/>
+              <w:bottom w:val="single" w:color="D9D3C8" w:sz="2"/>
+              <w:right w:val="none"/>
+            </w:tcBorders>
+            <w:tcMar>
+              <w:top w:type="dxa" w:w="70"/>
+              <w:left w:type="dxa" w:w="110"/>
+              <w:bottom w:type="dxa" w:w="70"/>
+              <w:right w:type="dxa" w:w="110"/>
+            </w:tcMar>
+          </w:tcPr>
+          <w:p>
+            <w:pPr>
+              <w:spacing w:after="0"/>
+              <w:jc w:val="right"/>
+            </w:pPr>
+            <w:r>
+              <w:rPr>
+                <w:rFonts w:ascii="Calibri" w:cs="Calibri" w:eastAsia="Calibri" w:hAnsi="Calibri"/>
+                <w:b w:val="false"/>
+                <w:bCs w:val="false"/>
+                <w:color w:val="1F1D1A"/>
+                <w:sz w:val="19"/>
+                <w:szCs w:val="19"/>
+              </w:rPr>
+              <w:t xml:space="preserve">$1,889</w:t>
+            </w:r>
+          </w:p>
+        </w:tc>
+        <w:tc>
+          <w:tcPr>
+            <w:tcW w:type="dxa" w:w="0"/>
+            <w:tcBorders>
+              <w:top w:val="single" w:color="D9D3C8" w:sz="2"/>
+              <w:left w:val="none"/>
+              <w:bottom w:val="single" w:color="D9D3C8" w:sz="2"/>
+              <w:right w:val="none"/>
+            </w:tcBorders>
+            <w:tcMar>
+              <w:top w:type="dxa" w:w="70"/>
+              <w:left w:type="dxa" w:w="110"/>
+              <w:bottom w:type="dxa" w:w="70"/>
+              <w:right w:type="dxa" w:w="110"/>
+            </w:tcMar>
+          </w:tcPr>
+          <w:p>
+            <w:pPr>
+              <w:spacing w:after="0"/>
+              <w:jc w:val="right"/>
+            </w:pPr>
+            <w:r>
+              <w:rPr>
+                <w:rFonts w:ascii="Calibri" w:cs="Calibri" w:eastAsia="Calibri" w:hAnsi="Calibri"/>
+                <w:b w:val="false"/>
+                <w:bCs w:val="false"/>
+                <w:color w:val="1F1D1A"/>
+                <w:sz w:val="19"/>
+                <w:szCs w:val="19"/>
+              </w:rPr>
+              <w:t xml:space="preserve">36%</w:t>
+            </w:r>
+          </w:p>
+        </w:tc>
+        <w:tc>
+          <w:tcPr>
+            <w:tcW w:type="dxa" w:w="0"/>
+            <w:tcBorders>
+              <w:top w:val="single" w:color="D9D3C8" w:sz="2"/>
+              <w:left w:val="none"/>
+              <w:bottom w:val="single" w:color="D9D3C8" w:sz="2"/>
+              <w:right w:val="none"/>
+            </w:tcBorders>
+            <w:tcMar>
+              <w:top w:type="dxa" w:w="70"/>
+              <w:left w:type="dxa" w:w="110"/>
+              <w:bottom w:type="dxa" w:w="70"/>
+              <w:right w:type="dxa" w:w="110"/>
+            </w:tcMar>
+          </w:tcPr>
+          <w:p>
+            <w:pPr>
+              <w:spacing w:after="0"/>
+              <w:jc w:val="right"/>
+            </w:pPr>
+            <w:r>
+              <w:rPr>
+                <w:rFonts w:ascii="Calibri" w:cs="Calibri" w:eastAsia="Calibri" w:hAnsi="Calibri"/>
+                <w:b w:val="false"/>
+                <w:bCs w:val="false"/>
+                <w:color w:val="1F1D1A"/>
+                <w:sz w:val="19"/>
+                <w:szCs w:val="19"/>
+              </w:rPr>
+              <w:t xml:space="preserve">$2,250</w:t>
+            </w:r>
+          </w:p>
+        </w:tc>
+        <w:tc>
+          <w:tcPr>
+            <w:tcW w:type="dxa" w:w="0"/>
+            <w:tcBorders>
+              <w:top w:val="single" w:color="D9D3C8" w:sz="2"/>
+              <w:left w:val="none"/>
+              <w:bottom w:val="single" w:color="D9D3C8" w:sz="2"/>
+              <w:right w:val="none"/>
+            </w:tcBorders>
+            <w:tcMar>
+              <w:top w:type="dxa" w:w="70"/>
+              <w:left w:type="dxa" w:w="110"/>
+              <w:bottom w:type="dxa" w:w="70"/>
+              <w:right w:type="dxa" w:w="110"/>
+            </w:tcMar>
+          </w:tcPr>
+          <w:p>
+            <w:pPr>
+              <w:spacing w:after="0"/>
+              <w:jc w:val="right"/>
+            </w:pPr>
+            <w:r>
+              <w:rPr>
+                <w:rFonts w:ascii="Calibri" w:cs="Calibri" w:eastAsia="Calibri" w:hAnsi="Calibri"/>
+                <w:b w:val="false"/>
+                <w:bCs w:val="false"/>
+                <w:color w:val="1F1D1A"/>
+                <w:sz w:val="19"/>
+                <w:szCs w:val="19"/>
+              </w:rPr>
+              <w:t xml:space="preserve">49%</w:t>
+            </w:r>
+          </w:p>
+        </w:tc>
+      </w:tr>
+      <w:tr>
+        <w:tc>
+          <w:tcPr>
+            <w:tcW w:type="dxa" w:w="0"/>
+            <w:tcBorders>
+              <w:top w:val="single" w:color="D9D3C8" w:sz="2"/>
+              <w:left w:val="none"/>
+              <w:bottom w:val="single" w:color="D9D3C8" w:sz="2"/>
+              <w:right w:val="none"/>
+            </w:tcBorders>
+            <w:tcMar>
+              <w:top w:type="dxa" w:w="70"/>
+              <w:left w:type="dxa" w:w="110"/>
+              <w:bottom w:type="dxa" w:w="70"/>
+              <w:right w:type="dxa" w:w="110"/>
+            </w:tcMar>
+          </w:tcPr>
+          <w:p>
+            <w:pPr>
+              <w:spacing w:after="0"/>
+              <w:jc w:val="left"/>
+            </w:pPr>
+            <w:r>
+              <w:rPr>
+                <w:rFonts w:ascii="Calibri" w:cs="Calibri" w:eastAsia="Calibri" w:hAnsi="Calibri"/>
+                <w:b w:val="false"/>
+                <w:bCs w:val="false"/>
+                <w:color w:val="1F1D1A"/>
+                <w:sz w:val="19"/>
+                <w:szCs w:val="19"/>
+              </w:rPr>
+              <w:t xml:space="preserve">$1,300 – 1,700</w:t>
+            </w:r>
+          </w:p>
+        </w:tc>
+        <w:tc>
+          <w:tcPr>
+            <w:tcW w:type="dxa" w:w="0"/>
+            <w:tcBorders>
+              <w:top w:val="single" w:color="D9D3C8" w:sz="2"/>
+              <w:left w:val="none"/>
+              <w:bottom w:val="single" w:color="D9D3C8" w:sz="2"/>
+              <w:right w:val="none"/>
+            </w:tcBorders>
+            <w:tcMar>
+              <w:top w:type="dxa" w:w="70"/>
+              <w:left w:type="dxa" w:w="110"/>
+              <w:bottom w:type="dxa" w:w="70"/>
+              <w:right w:type="dxa" w:w="110"/>
+            </w:tcMar>
+          </w:tcPr>
+          <w:p>
+            <w:pPr>
+              <w:spacing w:after="0"/>
+              <w:jc w:val="right"/>
+            </w:pPr>
+            <w:r>
+              <w:rPr>
+                <w:rFonts w:ascii="Calibri" w:cs="Calibri" w:eastAsia="Calibri" w:hAnsi="Calibri"/>
+                <w:b w:val="false"/>
+                <w:bCs w:val="false"/>
+                <w:color w:val="1F1D1A"/>
+                <w:sz w:val="19"/>
+                <w:szCs w:val="19"/>
+              </w:rPr>
+              <w:t xml:space="preserve">$2,500</w:t>
+            </w:r>
+          </w:p>
+        </w:tc>
+        <w:tc>
+          <w:tcPr>
+            <w:tcW w:type="dxa" w:w="0"/>
+            <w:tcBorders>
+              <w:top w:val="single" w:color="D9D3C8" w:sz="2"/>
+              <w:left w:val="none"/>
+              <w:bottom w:val="single" w:color="D9D3C8" w:sz="2"/>
+              <w:right w:val="none"/>
+            </w:tcBorders>
+            <w:tcMar>
+              <w:top w:type="dxa" w:w="70"/>
+              <w:left w:type="dxa" w:w="110"/>
+              <w:bottom w:type="dxa" w:w="70"/>
+              <w:right w:type="dxa" w:w="110"/>
+            </w:tcMar>
+          </w:tcPr>
+          <w:p>
+            <w:pPr>
+              <w:spacing w:after="0"/>
+              <w:jc w:val="right"/>
+            </w:pPr>
+            <w:r>
+              <w:rPr>
+                <w:rFonts w:ascii="Calibri" w:cs="Calibri" w:eastAsia="Calibri" w:hAnsi="Calibri"/>
+                <w:b w:val="false"/>
+                <w:bCs w:val="false"/>
+                <w:color w:val="1F1D1A"/>
+                <w:sz w:val="19"/>
+                <w:szCs w:val="19"/>
+              </w:rPr>
+              <w:t xml:space="preserve">40%</w:t>
+            </w:r>
+          </w:p>
+        </w:tc>
+        <w:tc>
+          <w:tcPr>
+            <w:tcW w:type="dxa" w:w="0"/>
+            <w:tcBorders>
+              <w:top w:val="single" w:color="D9D3C8" w:sz="2"/>
+              <w:left w:val="none"/>
+              <w:bottom w:val="single" w:color="D9D3C8" w:sz="2"/>
+              <w:right w:val="none"/>
+            </w:tcBorders>
+            <w:tcMar>
+              <w:top w:type="dxa" w:w="70"/>
+              <w:left w:type="dxa" w:w="110"/>
+              <w:bottom w:type="dxa" w:w="70"/>
+              <w:right w:type="dxa" w:w="110"/>
+            </w:tcMar>
+          </w:tcPr>
+          <w:p>
+            <w:pPr>
+              <w:spacing w:after="0"/>
+              <w:jc w:val="right"/>
+            </w:pPr>
+            <w:r>
+              <w:rPr>
+                <w:rFonts w:ascii="Calibri" w:cs="Calibri" w:eastAsia="Calibri" w:hAnsi="Calibri"/>
+                <w:b w:val="false"/>
+                <w:bCs w:val="false"/>
+                <w:color w:val="1F1D1A"/>
+                <w:sz w:val="19"/>
+                <w:szCs w:val="19"/>
+              </w:rPr>
+              <w:t xml:space="preserve">$2,550</w:t>
+            </w:r>
+          </w:p>
+        </w:tc>
+        <w:tc>
+          <w:tcPr>
+            <w:tcW w:type="dxa" w:w="0"/>
+            <w:tcBorders>
+              <w:top w:val="single" w:color="D9D3C8" w:sz="2"/>
+              <w:left w:val="none"/>
+              <w:bottom w:val="single" w:color="D9D3C8" w:sz="2"/>
+              <w:right w:val="none"/>
+            </w:tcBorders>
+            <w:tcMar>
+              <w:top w:type="dxa" w:w="70"/>
+              <w:left w:type="dxa" w:w="110"/>
+              <w:bottom w:type="dxa" w:w="70"/>
+              <w:right w:type="dxa" w:w="110"/>
+            </w:tcMar>
+          </w:tcPr>
+          <w:p>
+            <w:pPr>
+              <w:spacing w:after="0"/>
+              <w:jc w:val="right"/>
+            </w:pPr>
+            <w:r>
+              <w:rPr>
+                <w:rFonts w:ascii="Calibri" w:cs="Calibri" w:eastAsia="Calibri" w:hAnsi="Calibri"/>
+                <w:b w:val="false"/>
+                <w:bCs w:val="false"/>
+                <w:color w:val="1F1D1A"/>
+                <w:sz w:val="19"/>
+                <w:szCs w:val="19"/>
+              </w:rPr>
+              <w:t xml:space="preserve">40%</w:t>
+            </w:r>
+          </w:p>
+        </w:tc>
+      </w:tr>
+    </w:tbl>
+    <w:p>
+      <w:pPr>
+        <w:spacing w:after="120" w:before="0"/>
+      </w:pPr>
+      <w:r>
+        <w:rPr>
+          <w:rFonts w:ascii="Calibri" w:cs="Calibri" w:eastAsia="Calibri" w:hAnsi="Calibri"/>
+          <w:color w:val="1F1D1A"/>
+          <w:sz w:val="21"/>
+          <w:szCs w:val="21"/>
+        </w:rPr>
+        <w:t xml:space="preserve"/>
+      </w:r>
+    </w:p>
+    <w:p>
+      <w:pPr>
+        <w:spacing w:after="140" w:before="0"/>
+      </w:pPr>
+      <w:r>
+        <w:rPr>
+          <w:rFonts w:ascii="Calibri" w:cs="Calibri" w:eastAsia="Calibri" w:hAnsi="Calibri"/>
+          <w:color w:val="1F1D1A"/>
+          <w:sz w:val="21"/>
+          <w:szCs w:val="21"/>
+        </w:rPr>
+        <w:t xml:space="preserve">In the $800–1,000 band Franklin lists a chair at $1,775 against your $1,399, then takes 47% off against your 37%. The shopper sees a more expensive chair with a bigger discount, landing beside yours. That is a deliberate position, not a price point.</w:t>
+      </w:r>
+    </w:p>
+    <w:p>
+      <w:pPr>
+        <w:spacing w:after="120" w:before="0"/>
+      </w:pPr>
+      <w:r>
+        <w:rPr>
+          <w:rFonts w:ascii="Calibri" w:cs="Calibri" w:eastAsia="Calibri" w:hAnsi="Calibri"/>
+          <w:color w:val="1F1D1A"/>
+          <w:sz w:val="21"/>
+          <w:szCs w:val="21"/>
+        </w:rPr>
+        <w:t xml:space="preserve">Where you are not exposed: </w:t>
+      </w:r>
+      <w:r>
+        <w:rPr>
+          <w:rFonts w:ascii="Calibri" w:cs="Calibri" w:eastAsia="Calibri" w:hAnsi="Calibri"/>
+          <w:b/>
+          <w:bCs/>
+          <w:color w:val="1F1D1A"/>
+          <w:sz w:val="21"/>
+          <w:szCs w:val="21"/>
+        </w:rPr>
+        <w:t xml:space="preserve">Franklin has nothing above $1,600, where you have eight models</w:t>
+      </w:r>
+      <w:r>
+        <w:rPr>
+          <w:rFonts w:ascii="Calibri" w:cs="Calibri" w:eastAsia="Calibri" w:hAnsi="Calibri"/>
+          <w:color w:val="1F1D1A"/>
+          <w:sz w:val="21"/>
+          <w:szCs w:val="21"/>
+        </w:rPr>
+        <w:t xml:space="preserve"> — including Clayton Gold Lux-Lift at $2,200 and Greyson Leather Tri-Power at $2,000. You also out-discount them below $600 (53% against 43%) and carry swivel on 83% of models against their 53%. Franklin counters with more power (31% against 27%), more lift (14% against 6%) and more leather (37% against 25%).</w:t>
+      </w:r>
+    </w:p>
+    <w:p>
+      <w:pPr>
+        <w:spacing w:after="120" w:before="0"/>
+      </w:pPr>
+      <w:r>
+        <w:rPr>
+          <w:rFonts w:ascii="Calibri" w:cs="Calibri" w:eastAsia="Calibri" w:hAnsi="Calibri"/>
+          <w:color w:val="1F1D1A"/>
+          <w:sz w:val="21"/>
+          <w:szCs w:val="21"/>
+        </w:rPr>
+        <w:t xml:space="preserve">Franklin was not on the competitor list we discussed in July. It surfaced from the data rather than from anyone's list, which is the part I would want to know.</w:t>
+      </w:r>
+    </w:p>
+    <w:p>
+      <w:pPr>
+        <w:pageBreakBefore/>
+      </w:pPr>
+    </w:p>
+    <w:p>
+      <w:pPr>
+        <w:pStyle w:val="Heading1"/>
+        <w:spacing w:after="140" w:before="320"/>
+      </w:pPr>
+      <w:r>
+        <w:rPr>
+          <w:rFonts w:ascii="Calibri" w:cs="Calibri" w:eastAsia="Calibri" w:hAnsi="Calibri"/>
+          <w:b/>
+          <w:bCs/>
+          <w:color w:val="1F1D1A"/>
+          <w:sz w:val="26"/>
+          <w:szCs w:val="26"/>
+        </w:rPr>
+        <w:t xml:space="preserve">4.  Slumberland beats your own Minneapolis stores where the margin is</w:t>
       </w:r>
     </w:p>
     <w:p>
@@ -3840,7 +8056,7 @@
           <w:sz w:val="21"/>
           <w:szCs w:val="21"/>
         </w:rPr>
-        <w:t xml:space="preserve">Model matching is on model name, form and drive type, comparing the cheapest available cover against the cheapest stocked SKU — how a shopper would actually buy each model, not an identical-cover match. 36 Canadian stores are excluded: the pages state no currency, and pooling them would confuse an exchange rate with a pricing decision.</w:t>
+        <w:t xml:space="preserve">Brand comparisons are counted by model, taking each model’s cheapest configuration. Cross-channel matching is on model name, form and drive type, comparing the cheapest available cover against the cheapest stocked SKU — how a shopper would actually buy each model, not an identical-cover match. 36 Canadian stores are excluded: the pages state no currency, and pooling them would confuse an exchange rate with a pricing decision.</w:t>
       </w:r>
     </w:p>
     <w:p>

</xml_diff>